<commit_message>
docs: Documented Design & justification section, added PDF of .docx file
</commit_message>
<xml_diff>
--- a/docs/RFR New Member Project Design Document.docx
+++ b/docs/RFR New Member Project Design Document.docx
@@ -195,7 +195,7 @@
       <w:pPr>
         <w:numPr>
           <w:ilvl w:val="0"/>
-          <w:numId w:val="3"/>
+          <w:numId w:val="10"/>
         </w:numPr>
         <w:rPr>
           <w:lang w:val="en-US"/>
@@ -212,7 +212,7 @@
       <w:pPr>
         <w:numPr>
           <w:ilvl w:val="0"/>
-          <w:numId w:val="3"/>
+          <w:numId w:val="10"/>
         </w:numPr>
         <w:rPr>
           <w:lang w:val="en-US"/>
@@ -229,7 +229,7 @@
       <w:pPr>
         <w:numPr>
           <w:ilvl w:val="0"/>
-          <w:numId w:val="3"/>
+          <w:numId w:val="10"/>
         </w:numPr>
         <w:rPr>
           <w:lang w:val="en-US"/>
@@ -246,7 +246,7 @@
       <w:pPr>
         <w:numPr>
           <w:ilvl w:val="0"/>
-          <w:numId w:val="3"/>
+          <w:numId w:val="10"/>
         </w:numPr>
         <w:rPr>
           <w:lang w:val="en-US"/>
@@ -263,7 +263,7 @@
       <w:pPr>
         <w:numPr>
           <w:ilvl w:val="1"/>
-          <w:numId w:val="3"/>
+          <w:numId w:val="10"/>
         </w:numPr>
         <w:rPr>
           <w:lang w:val="en-US"/>
@@ -280,7 +280,7 @@
       <w:pPr>
         <w:numPr>
           <w:ilvl w:val="1"/>
-          <w:numId w:val="3"/>
+          <w:numId w:val="10"/>
         </w:numPr>
         <w:rPr>
           <w:lang w:val="en-US"/>
@@ -297,7 +297,7 @@
       <w:pPr>
         <w:numPr>
           <w:ilvl w:val="1"/>
-          <w:numId w:val="3"/>
+          <w:numId w:val="10"/>
         </w:numPr>
         <w:rPr>
           <w:lang w:val="en-US"/>
@@ -314,7 +314,7 @@
       <w:pPr>
         <w:numPr>
           <w:ilvl w:val="1"/>
-          <w:numId w:val="3"/>
+          <w:numId w:val="10"/>
         </w:numPr>
         <w:rPr>
           <w:lang w:val="en-US"/>
@@ -331,7 +331,7 @@
       <w:pPr>
         <w:numPr>
           <w:ilvl w:val="1"/>
-          <w:numId w:val="3"/>
+          <w:numId w:val="10"/>
         </w:numPr>
         <w:rPr>
           <w:lang w:val="en-US"/>
@@ -346,6 +346,23 @@
     </w:p>
     <w:p>
       <w:pPr>
+        <w:numPr>
+          <w:ilvl w:val="1"/>
+          <w:numId w:val="10"/>
+        </w:numPr>
+        <w:rPr>
+          <w:lang w:val="en-US"/>
+        </w:rPr>
+      </w:pPr>
+      <w:r>
+        <w:rPr>
+          <w:lang w:val="en-US"/>
+        </w:rPr>
+        <w:t>MOSFET</w:t>
+      </w:r>
+    </w:p>
+    <w:p>
+      <w:pPr>
         <w:rPr>
           <w:lang w:val="en-US"/>
         </w:rPr>
@@ -361,7 +378,7 @@
       <w:pPr>
         <w:numPr>
           <w:ilvl w:val="0"/>
-          <w:numId w:val="4"/>
+          <w:numId w:val="11"/>
         </w:numPr>
         <w:rPr>
           <w:lang w:val="en-US"/>
@@ -378,7 +395,7 @@
       <w:pPr>
         <w:numPr>
           <w:ilvl w:val="0"/>
-          <w:numId w:val="4"/>
+          <w:numId w:val="11"/>
         </w:numPr>
         <w:rPr>
           <w:lang w:val="en-US"/>
@@ -409,7 +426,7 @@
       <w:pPr>
         <w:numPr>
           <w:ilvl w:val="0"/>
-          <w:numId w:val="4"/>
+          <w:numId w:val="11"/>
         </w:numPr>
         <w:rPr>
           <w:lang w:val="en-US"/>
@@ -426,7 +443,7 @@
       <w:pPr>
         <w:numPr>
           <w:ilvl w:val="0"/>
-          <w:numId w:val="4"/>
+          <w:numId w:val="11"/>
         </w:numPr>
         <w:rPr>
           <w:lang w:val="en-US"/>
@@ -443,7 +460,7 @@
       <w:pPr>
         <w:numPr>
           <w:ilvl w:val="0"/>
-          <w:numId w:val="4"/>
+          <w:numId w:val="11"/>
         </w:numPr>
         <w:rPr>
           <w:lang w:val="en-US"/>
@@ -456,7 +473,37 @@
         <w:t>Red LED to signify when a sensor is above 60 degrees C</w:t>
       </w:r>
     </w:p>
-    <w:p/>
+    <w:p>
+      <w:pPr>
+        <w:numPr>
+          <w:ilvl w:val="0"/>
+          <w:numId w:val="11"/>
+        </w:numPr>
+        <w:rPr>
+          <w:lang w:val="en-US"/>
+        </w:rPr>
+      </w:pPr>
+      <w:r>
+        <w:rPr>
+          <w:lang w:val="en-US"/>
+        </w:rPr>
+        <w:t xml:space="preserve">MOSFET </w:t>
+      </w:r>
+      <w:proofErr w:type="gramStart"/>
+      <w:r>
+        <w:rPr>
+          <w:lang w:val="en-US"/>
+        </w:rPr>
+        <w:t>in order to</w:t>
+      </w:r>
+      <w:proofErr w:type="gramEnd"/>
+      <w:r>
+        <w:rPr>
+          <w:lang w:val="en-US"/>
+        </w:rPr>
+        <w:t xml:space="preserve"> cycle Cn, Cn+2, Cn+4, etc., skipping adjacent cells. </w:t>
+      </w:r>
+    </w:p>
     <w:p/>
     <w:p>
       <w:pPr>
@@ -1140,9 +1187,679 @@
     </w:p>
     <w:p>
       <w:pPr>
+        <w:rPr>
+          <w:lang w:val="en-US"/>
+        </w:rPr>
+      </w:pPr>
+      <w:r>
+        <w:rPr>
+          <w:lang w:val="en-US"/>
+        </w:rPr>
+        <w:t xml:space="preserve">Temperature sensor: </w:t>
+      </w:r>
+      <w:hyperlink r:id="rId10" w:history="1">
+        <w:r>
+          <w:rPr>
+            <w:rStyle w:val="Hyperlink"/>
+            <w:lang w:val="en-US"/>
+          </w:rPr>
+          <w:t>Sony-Murata-VTC5A-Li-ion-Battery-Module-With-Temperature-Sensor</w:t>
+        </w:r>
+      </w:hyperlink>
+    </w:p>
+    <w:p>
+      <w:pPr>
         <w:numPr>
           <w:ilvl w:val="0"/>
-          <w:numId w:val="9"/>
+          <w:numId w:val="12"/>
+        </w:numPr>
+        <w:rPr>
+          <w:lang w:val="en-US"/>
+        </w:rPr>
+      </w:pPr>
+      <w:r>
+        <w:rPr>
+          <w:lang w:val="en-US"/>
+        </w:rPr>
+        <w:t>The output voltage decreases as the temperature read by the sensor increases by around 5mV per increase in C</w:t>
+      </w:r>
+    </w:p>
+    <w:p>
+      <w:pPr>
+        <w:numPr>
+          <w:ilvl w:val="1"/>
+          <w:numId w:val="12"/>
+        </w:numPr>
+        <w:rPr>
+          <w:lang w:val="en-US"/>
+        </w:rPr>
+      </w:pPr>
+      <w:r>
+        <w:rPr>
+          <w:lang w:val="en-US"/>
+        </w:rPr>
+        <w:t>With 60 degrees C being represented as 1.51 V output</w:t>
+      </w:r>
+    </w:p>
+    <w:p>
+      <w:pPr>
+        <w:numPr>
+          <w:ilvl w:val="0"/>
+          <w:numId w:val="12"/>
+        </w:numPr>
+        <w:rPr>
+          <w:lang w:val="en-US"/>
+        </w:rPr>
+      </w:pPr>
+      <w:r>
+        <w:rPr>
+          <w:lang w:val="en-US"/>
+        </w:rPr>
+        <w:t>When trying to read the temperature of multiple sensors, it should be done in two cycles, skipping over adjacent battery cell sensors</w:t>
+      </w:r>
+    </w:p>
+    <w:p>
+      <w:pPr>
+        <w:numPr>
+          <w:ilvl w:val="0"/>
+          <w:numId w:val="12"/>
+        </w:numPr>
+        <w:rPr>
+          <w:lang w:val="en-US"/>
+        </w:rPr>
+      </w:pPr>
+      <w:r>
+        <w:rPr>
+          <w:lang w:val="en-US"/>
+        </w:rPr>
+        <w:t>Sensor characteristics that are important to take into consideration:</w:t>
+      </w:r>
+    </w:p>
+    <w:p>
+      <w:pPr>
+        <w:numPr>
+          <w:ilvl w:val="1"/>
+          <w:numId w:val="12"/>
+        </w:numPr>
+        <w:rPr>
+          <w:lang w:val="en-US"/>
+        </w:rPr>
+      </w:pPr>
+      <w:proofErr w:type="spellStart"/>
+      <w:r>
+        <w:rPr>
+          <w:lang w:val="en-US"/>
+        </w:rPr>
+        <w:lastRenderedPageBreak/>
+        <w:t>Vmin</w:t>
+      </w:r>
+      <w:proofErr w:type="spellEnd"/>
+      <w:r>
+        <w:rPr>
+          <w:lang w:val="en-US"/>
+        </w:rPr>
+        <w:t xml:space="preserve"> = </w:t>
+      </w:r>
+      <w:proofErr w:type="spellStart"/>
+      <w:r>
+        <w:rPr>
+          <w:lang w:val="en-US"/>
+        </w:rPr>
+        <w:t>Vcc</w:t>
+      </w:r>
+      <w:proofErr w:type="spellEnd"/>
+      <w:r>
+        <w:rPr>
+          <w:lang w:val="en-US"/>
+        </w:rPr>
+        <w:t xml:space="preserve"> - </w:t>
+      </w:r>
+      <w:proofErr w:type="spellStart"/>
+      <w:r>
+        <w:rPr>
+          <w:lang w:val="en-US"/>
+        </w:rPr>
+        <w:t>Vout</w:t>
+      </w:r>
+      <w:proofErr w:type="spellEnd"/>
+      <w:r>
+        <w:rPr>
+          <w:lang w:val="en-US"/>
+        </w:rPr>
+        <w:t>, with a minimum of 10mV</w:t>
+      </w:r>
+    </w:p>
+    <w:p>
+      <w:pPr>
+        <w:numPr>
+          <w:ilvl w:val="1"/>
+          <w:numId w:val="12"/>
+        </w:numPr>
+        <w:rPr>
+          <w:lang w:val="en-US"/>
+        </w:rPr>
+      </w:pPr>
+      <w:proofErr w:type="spellStart"/>
+      <w:r>
+        <w:rPr>
+          <w:lang w:val="en-US"/>
+        </w:rPr>
+        <w:t>Vcc</w:t>
+      </w:r>
+      <w:proofErr w:type="spellEnd"/>
+      <w:r>
+        <w:rPr>
+          <w:lang w:val="en-US"/>
+        </w:rPr>
+        <w:t xml:space="preserve"> should be &gt;2.5V</w:t>
+      </w:r>
+    </w:p>
+    <w:p>
+      <w:pPr>
+        <w:numPr>
+          <w:ilvl w:val="1"/>
+          <w:numId w:val="12"/>
+        </w:numPr>
+        <w:rPr>
+          <w:lang w:val="en-US"/>
+        </w:rPr>
+      </w:pPr>
+      <w:r>
+        <w:rPr>
+          <w:lang w:val="en-US"/>
+        </w:rPr>
+        <w:t xml:space="preserve">Forward </w:t>
+      </w:r>
+      <w:proofErr w:type="gramStart"/>
+      <w:r>
+        <w:rPr>
+          <w:lang w:val="en-US"/>
+        </w:rPr>
+        <w:t>current  =</w:t>
+      </w:r>
+      <w:proofErr w:type="gramEnd"/>
+      <w:r>
+        <w:rPr>
+          <w:lang w:val="en-US"/>
+        </w:rPr>
+        <w:t xml:space="preserve"> (</w:t>
+      </w:r>
+      <w:proofErr w:type="spellStart"/>
+      <w:r>
+        <w:rPr>
+          <w:lang w:val="en-US"/>
+        </w:rPr>
+        <w:t>Vcc</w:t>
+      </w:r>
+      <w:proofErr w:type="spellEnd"/>
+      <w:r>
+        <w:rPr>
+          <w:lang w:val="en-US"/>
+        </w:rPr>
+        <w:t xml:space="preserve"> - </w:t>
+      </w:r>
+      <w:proofErr w:type="spellStart"/>
+      <w:r>
+        <w:rPr>
+          <w:lang w:val="en-US"/>
+        </w:rPr>
+        <w:t>Vout</w:t>
+      </w:r>
+      <w:proofErr w:type="spellEnd"/>
+      <w:r>
+        <w:rPr>
+          <w:lang w:val="en-US"/>
+        </w:rPr>
+        <w:t>)/R, with a minimum of 0.4 and a maximum of 15 mA. </w:t>
+      </w:r>
+    </w:p>
+    <w:p>
+      <w:pPr>
+        <w:rPr>
+          <w:lang w:val="en-US"/>
+        </w:rPr>
+      </w:pPr>
+      <w:r>
+        <w:rPr>
+          <w:lang w:val="en-US"/>
+        </w:rPr>
+        <w:t xml:space="preserve">Multiplexer: </w:t>
+      </w:r>
+      <w:hyperlink r:id="rId11" w:history="1">
+        <w:r>
+          <w:rPr>
+            <w:rStyle w:val="Hyperlink"/>
+            <w:lang w:val="en-US"/>
+          </w:rPr>
+          <w:t>CD74HC4067</w:t>
+        </w:r>
+      </w:hyperlink>
+      <w:r>
+        <w:rPr>
+          <w:lang w:val="en-US"/>
+        </w:rPr>
+        <w:t> </w:t>
+      </w:r>
+    </w:p>
+    <w:p>
+      <w:pPr>
+        <w:numPr>
+          <w:ilvl w:val="0"/>
+          <w:numId w:val="13"/>
+        </w:numPr>
+        <w:rPr>
+          <w:lang w:val="en-US"/>
+        </w:rPr>
+      </w:pPr>
+      <w:r>
+        <w:rPr>
+          <w:lang w:val="en-US"/>
+        </w:rPr>
+        <w:t>When looking at the operating conditions, several things stood out, particularly the recommended operating conditions:</w:t>
+      </w:r>
+    </w:p>
+    <w:p>
+      <w:pPr>
+        <w:numPr>
+          <w:ilvl w:val="1"/>
+          <w:numId w:val="13"/>
+        </w:numPr>
+        <w:rPr>
+          <w:lang w:val="en-US"/>
+        </w:rPr>
+      </w:pPr>
+      <w:proofErr w:type="spellStart"/>
+      <w:r>
+        <w:rPr>
+          <w:lang w:val="en-US"/>
+        </w:rPr>
+        <w:t>Vcc</w:t>
+      </w:r>
+      <w:proofErr w:type="spellEnd"/>
+      <w:r>
+        <w:rPr>
+          <w:lang w:val="en-US"/>
+        </w:rPr>
+        <w:t xml:space="preserve"> min of 2 and max of 6 V</w:t>
+      </w:r>
+    </w:p>
+    <w:p>
+      <w:pPr>
+        <w:numPr>
+          <w:ilvl w:val="1"/>
+          <w:numId w:val="13"/>
+        </w:numPr>
+        <w:rPr>
+          <w:lang w:val="en-US"/>
+        </w:rPr>
+      </w:pPr>
+      <w:r>
+        <w:rPr>
+          <w:lang w:val="en-US"/>
+        </w:rPr>
+        <w:t xml:space="preserve">Analog switch max voltage of </w:t>
+      </w:r>
+      <w:proofErr w:type="spellStart"/>
+      <w:r>
+        <w:rPr>
+          <w:lang w:val="en-US"/>
+        </w:rPr>
+        <w:t>Vcc</w:t>
+      </w:r>
+      <w:proofErr w:type="spellEnd"/>
+    </w:p>
+    <w:p>
+      <w:pPr>
+        <w:numPr>
+          <w:ilvl w:val="1"/>
+          <w:numId w:val="13"/>
+        </w:numPr>
+        <w:rPr>
+          <w:lang w:val="en-US"/>
+        </w:rPr>
+      </w:pPr>
+      <w:r>
+        <w:rPr>
+          <w:lang w:val="en-US"/>
+        </w:rPr>
+        <w:t>And a max input rise and fall time of 400 to 1000 ns, depending on a range of 2.5 to 6v</w:t>
+      </w:r>
+    </w:p>
+    <w:p>
+      <w:pPr>
+        <w:rPr>
+          <w:lang w:val="en-US"/>
+        </w:rPr>
+      </w:pPr>
+      <w:r>
+        <w:rPr>
+          <w:lang w:val="en-US"/>
+        </w:rPr>
+        <w:t xml:space="preserve">Arduino: </w:t>
+      </w:r>
+      <w:hyperlink r:id="rId12" w:history="1">
+        <w:r>
+          <w:rPr>
+            <w:rStyle w:val="Hyperlink"/>
+            <w:lang w:val="en-US"/>
+          </w:rPr>
+          <w:t>Arduino Nano</w:t>
+        </w:r>
+      </w:hyperlink>
+    </w:p>
+    <w:p>
+      <w:pPr>
+        <w:numPr>
+          <w:ilvl w:val="0"/>
+          <w:numId w:val="14"/>
+        </w:numPr>
+        <w:rPr>
+          <w:lang w:val="en-US"/>
+        </w:rPr>
+      </w:pPr>
+      <w:proofErr w:type="spellStart"/>
+      <w:r>
+        <w:rPr>
+          <w:lang w:val="en-US"/>
+        </w:rPr>
+        <w:t>Vcc</w:t>
+      </w:r>
+      <w:proofErr w:type="spellEnd"/>
+      <w:r>
+        <w:rPr>
+          <w:lang w:val="en-US"/>
+        </w:rPr>
+        <w:t xml:space="preserve"> should be 5V</w:t>
+      </w:r>
+    </w:p>
+    <w:p>
+      <w:pPr>
+        <w:numPr>
+          <w:ilvl w:val="0"/>
+          <w:numId w:val="14"/>
+        </w:numPr>
+        <w:rPr>
+          <w:lang w:val="en-US"/>
+        </w:rPr>
+      </w:pPr>
+      <w:r>
+        <w:rPr>
+          <w:lang w:val="en-US"/>
+        </w:rPr>
+        <w:t>Contains 14 digital and 8 analog pins</w:t>
+      </w:r>
+    </w:p>
+    <w:p>
+      <w:pPr>
+        <w:numPr>
+          <w:ilvl w:val="0"/>
+          <w:numId w:val="14"/>
+        </w:numPr>
+        <w:rPr>
+          <w:lang w:val="en-US"/>
+        </w:rPr>
+      </w:pPr>
+      <w:r>
+        <w:rPr>
+          <w:lang w:val="en-US"/>
+        </w:rPr>
+        <w:t>Cannot draw more than 50mA from the board</w:t>
+      </w:r>
+    </w:p>
+    <w:p>
+      <w:pPr>
+        <w:rPr>
+          <w:lang w:val="en-US"/>
+        </w:rPr>
+      </w:pPr>
+    </w:p>
+    <w:p>
+      <w:pPr>
+        <w:rPr>
+          <w:lang w:val="en-US"/>
+        </w:rPr>
+      </w:pPr>
+      <w:r>
+        <w:rPr>
+          <w:lang w:val="en-US"/>
+        </w:rPr>
+        <w:t xml:space="preserve">DCDC converter: </w:t>
+      </w:r>
+      <w:hyperlink r:id="rId13" w:history="1">
+        <w:r>
+          <w:rPr>
+            <w:rStyle w:val="Hyperlink"/>
+            <w:lang w:val="en-US"/>
+          </w:rPr>
+          <w:t>TSR 1-2450</w:t>
+        </w:r>
+      </w:hyperlink>
+    </w:p>
+    <w:p>
+      <w:pPr>
+        <w:numPr>
+          <w:ilvl w:val="0"/>
+          <w:numId w:val="15"/>
+        </w:numPr>
+        <w:rPr>
+          <w:lang w:val="en-US"/>
+        </w:rPr>
+      </w:pPr>
+      <w:r>
+        <w:rPr>
+          <w:lang w:val="en-US"/>
+        </w:rPr>
+        <w:t>From the specifications above, we decided that a good DCDC converter is the TSR 1-2450 for several reasons</w:t>
+      </w:r>
+    </w:p>
+    <w:p>
+      <w:pPr>
+        <w:numPr>
+          <w:ilvl w:val="0"/>
+          <w:numId w:val="15"/>
+        </w:numPr>
+        <w:rPr>
+          <w:lang w:val="en-US"/>
+        </w:rPr>
+      </w:pPr>
+      <w:r>
+        <w:rPr>
+          <w:lang w:val="en-US"/>
+        </w:rPr>
+        <w:t>Great range input to output</w:t>
+      </w:r>
+    </w:p>
+    <w:p>
+      <w:pPr>
+        <w:numPr>
+          <w:ilvl w:val="1"/>
+          <w:numId w:val="15"/>
+        </w:numPr>
+        <w:rPr>
+          <w:lang w:val="en-US"/>
+        </w:rPr>
+      </w:pPr>
+      <w:r>
+        <w:rPr>
+          <w:lang w:val="en-US"/>
+        </w:rPr>
+        <w:t>To output 5 V DC, you can input a range from 6.5-36 VDC</w:t>
+      </w:r>
+    </w:p>
+    <w:p>
+      <w:pPr>
+        <w:numPr>
+          <w:ilvl w:val="1"/>
+          <w:numId w:val="15"/>
+        </w:numPr>
+        <w:rPr>
+          <w:lang w:val="en-US"/>
+        </w:rPr>
+      </w:pPr>
+      <w:r>
+        <w:rPr>
+          <w:lang w:val="en-US"/>
+        </w:rPr>
+        <w:t>With 94% efficiency </w:t>
+      </w:r>
+    </w:p>
+    <w:p>
+      <w:pPr>
+        <w:numPr>
+          <w:ilvl w:val="0"/>
+          <w:numId w:val="15"/>
+        </w:numPr>
+        <w:rPr>
+          <w:lang w:val="en-US"/>
+        </w:rPr>
+      </w:pPr>
+      <w:r>
+        <w:rPr>
+          <w:lang w:val="en-US"/>
+        </w:rPr>
+        <w:t>Allows a max output current of 1A</w:t>
+      </w:r>
+    </w:p>
+    <w:p>
+      <w:pPr>
+        <w:numPr>
+          <w:ilvl w:val="1"/>
+          <w:numId w:val="15"/>
+        </w:numPr>
+        <w:rPr>
+          <w:lang w:val="en-US"/>
+        </w:rPr>
+      </w:pPr>
+      <w:r>
+        <w:rPr>
+          <w:lang w:val="en-US"/>
+        </w:rPr>
+        <w:t xml:space="preserve">Meeting </w:t>
+      </w:r>
+      <w:proofErr w:type="gramStart"/>
+      <w:r>
+        <w:rPr>
+          <w:lang w:val="en-US"/>
+        </w:rPr>
+        <w:t>all of</w:t>
+      </w:r>
+      <w:proofErr w:type="gramEnd"/>
+      <w:r>
+        <w:rPr>
+          <w:lang w:val="en-US"/>
+        </w:rPr>
+        <w:t xml:space="preserve"> our requirements and more.</w:t>
+      </w:r>
+    </w:p>
+    <w:p>
+      <w:pPr>
+        <w:numPr>
+          <w:ilvl w:val="0"/>
+          <w:numId w:val="15"/>
+        </w:numPr>
+        <w:rPr>
+          <w:lang w:val="en-US"/>
+        </w:rPr>
+      </w:pPr>
+      <w:r>
+        <w:rPr>
+          <w:lang w:val="en-US"/>
+        </w:rPr>
+        <w:t>Price: around $6.28 per converter, making it not a super expensive part</w:t>
+      </w:r>
+    </w:p>
+    <w:p>
+      <w:pPr>
+        <w:numPr>
+          <w:ilvl w:val="0"/>
+          <w:numId w:val="15"/>
+        </w:numPr>
+        <w:rPr>
+          <w:lang w:val="en-US"/>
+        </w:rPr>
+      </w:pPr>
+      <w:r>
+        <w:rPr>
+          <w:lang w:val="en-US"/>
+        </w:rPr>
+        <w:t>Contains short-circuit protection</w:t>
+      </w:r>
+    </w:p>
+    <w:p>
+      <w:pPr>
+        <w:rPr>
+          <w:lang w:val="en-US"/>
+        </w:rPr>
+      </w:pPr>
+    </w:p>
+    <w:p>
+      <w:pPr>
+        <w:rPr>
+          <w:lang w:val="en-US"/>
+        </w:rPr>
+      </w:pPr>
+      <w:r>
+        <w:rPr>
+          <w:lang w:val="en-US"/>
+        </w:rPr>
+        <w:t>We still need a way to signify if the temperature goes above the threshold, via an LED</w:t>
+      </w:r>
+      <w:r>
+        <w:rPr>
+          <w:lang w:val="en-US"/>
+        </w:rPr>
+        <w:br/>
+        <w:t xml:space="preserve">Sample LED (Unsure if we need it in the doc but included): </w:t>
+      </w:r>
+      <w:hyperlink r:id="rId14" w:history="1">
+        <w:r>
+          <w:rPr>
+            <w:rStyle w:val="Hyperlink"/>
+            <w:lang w:val="en-US"/>
+          </w:rPr>
+          <w:t>RED LED</w:t>
+        </w:r>
+      </w:hyperlink>
+    </w:p>
+    <w:p>
+      <w:pPr>
+        <w:numPr>
+          <w:ilvl w:val="0"/>
+          <w:numId w:val="16"/>
+        </w:numPr>
+        <w:rPr>
+          <w:lang w:val="en-US"/>
+        </w:rPr>
+      </w:pPr>
+      <w:r>
+        <w:rPr>
+          <w:lang w:val="en-US"/>
+        </w:rPr>
+        <w:t>Typical forward voltage of 1.9V</w:t>
+      </w:r>
+    </w:p>
+    <w:p>
+      <w:pPr>
+        <w:numPr>
+          <w:ilvl w:val="0"/>
+          <w:numId w:val="16"/>
+        </w:numPr>
+        <w:rPr>
+          <w:lang w:val="en-US"/>
+        </w:rPr>
+      </w:pPr>
+      <w:r>
+        <w:rPr>
+          <w:lang w:val="en-US"/>
+        </w:rPr>
+        <w:t>Forward current of 10mA</w:t>
+      </w:r>
+    </w:p>
+    <w:p>
+      <w:pPr>
+        <w:numPr>
+          <w:ilvl w:val="0"/>
+          <w:numId w:val="16"/>
         </w:numPr>
         <w:rPr>
           <w:lang w:val="en-US"/>
@@ -1169,7 +1886,103 @@
         <w:t>)/(If)</w:t>
       </w:r>
     </w:p>
-    <w:p/>
+    <w:p>
+      <w:pPr>
+        <w:rPr>
+          <w:lang w:val="en-US"/>
+        </w:rPr>
+      </w:pPr>
+    </w:p>
+    <w:p>
+      <w:pPr>
+        <w:rPr>
+          <w:lang w:val="en-US"/>
+        </w:rPr>
+      </w:pPr>
+      <w:r>
+        <w:rPr>
+          <w:lang w:val="en-US"/>
+        </w:rPr>
+        <w:t xml:space="preserve">MOSFET: </w:t>
+      </w:r>
+      <w:hyperlink r:id="rId15" w:history="1">
+        <w:r>
+          <w:rPr>
+            <w:rStyle w:val="Hyperlink"/>
+            <w:lang w:val="en-US"/>
+          </w:rPr>
+          <w:t>2N7000</w:t>
+        </w:r>
+      </w:hyperlink>
+    </w:p>
+    <w:p>
+      <w:pPr>
+        <w:numPr>
+          <w:ilvl w:val="0"/>
+          <w:numId w:val="17"/>
+        </w:numPr>
+        <w:rPr>
+          <w:lang w:val="en-US"/>
+        </w:rPr>
+      </w:pPr>
+      <w:r>
+        <w:rPr>
+          <w:lang w:val="en-US"/>
+        </w:rPr>
+        <w:t>Max gate-to-source voltage is 20V</w:t>
+      </w:r>
+    </w:p>
+    <w:p>
+      <w:pPr>
+        <w:numPr>
+          <w:ilvl w:val="0"/>
+          <w:numId w:val="17"/>
+        </w:numPr>
+        <w:rPr>
+          <w:lang w:val="en-US"/>
+        </w:rPr>
+      </w:pPr>
+      <w:r>
+        <w:rPr>
+          <w:lang w:val="en-US"/>
+        </w:rPr>
+        <w:t>Max drain-to-source voltage is 60V</w:t>
+      </w:r>
+    </w:p>
+    <w:p>
+      <w:pPr>
+        <w:numPr>
+          <w:ilvl w:val="0"/>
+          <w:numId w:val="17"/>
+        </w:numPr>
+        <w:rPr>
+          <w:lang w:val="en-US"/>
+        </w:rPr>
+      </w:pPr>
+      <w:r>
+        <w:rPr>
+          <w:lang w:val="en-US"/>
+        </w:rPr>
+        <w:t>200mA max to drain pin</w:t>
+      </w:r>
+    </w:p>
+    <w:p>
+      <w:pPr>
+        <w:numPr>
+          <w:ilvl w:val="1"/>
+          <w:numId w:val="17"/>
+        </w:numPr>
+        <w:rPr>
+          <w:lang w:val="en-US"/>
+        </w:rPr>
+      </w:pPr>
+      <w:r>
+        <w:rPr>
+          <w:lang w:val="en-US"/>
+        </w:rPr>
+        <w:t>Easiest way: including a 100omh resistor</w:t>
+      </w:r>
+    </w:p>
     <w:p>
       <w:pPr>
         <w:pStyle w:val="Heading1"/>
@@ -1184,8 +1997,724 @@
       <w:bookmarkEnd w:id="3"/>
     </w:p>
     <w:p>
-      <w:r>
-        <w:t>(start writing here)</w:t>
+      <w:pPr>
+        <w:rPr>
+          <w:lang w:val="en-US"/>
+        </w:rPr>
+      </w:pPr>
+      <w:proofErr w:type="gramStart"/>
+      <w:r>
+        <w:rPr>
+          <w:lang w:val="en-US"/>
+        </w:rPr>
+        <w:t>In order to</w:t>
+      </w:r>
+      <w:proofErr w:type="gramEnd"/>
+      <w:r>
+        <w:rPr>
+          <w:lang w:val="en-US"/>
+        </w:rPr>
+        <w:t xml:space="preserve"> step down the voltage from 12V to 5V, that is the operating voltage of the Arduino and multiplexer, we used the DCDC converter and decided that the Vin pin for the Arduino is pin 27 and not 30 due to pin 30 requiring 7-12V.</w:t>
+      </w:r>
+    </w:p>
+    <w:p>
+      <w:pPr>
+        <w:rPr>
+          <w:lang w:val="en-US"/>
+        </w:rPr>
+      </w:pPr>
+      <w:r>
+        <w:rPr>
+          <w:lang w:val="en-US"/>
+        </w:rPr>
+        <w:lastRenderedPageBreak/>
+        <w:drawing>
+          <wp:inline distT="0" distB="0" distL="0" distR="0" wp14:anchorId="736AA86F" wp14:editId="68DF8259">
+            <wp:extent cx="5943600" cy="2247900"/>
+            <wp:effectExtent l="0" t="0" r="0" b="0"/>
+            <wp:docPr id="1362297916" name="Picture 18"/>
+            <wp:cNvGraphicFramePr>
+              <a:graphicFrameLocks xmlns:a="http://schemas.openxmlformats.org/drawingml/2006/main" noChangeAspect="1"/>
+            </wp:cNvGraphicFramePr>
+            <a:graphic xmlns:a="http://schemas.openxmlformats.org/drawingml/2006/main">
+              <a:graphicData uri="http://schemas.openxmlformats.org/drawingml/2006/picture">
+                <pic:pic xmlns:pic="http://schemas.openxmlformats.org/drawingml/2006/picture">
+                  <pic:nvPicPr>
+                    <pic:cNvPr id="0" name="Picture 46"/>
+                    <pic:cNvPicPr>
+                      <a:picLocks noChangeAspect="1" noChangeArrowheads="1"/>
+                    </pic:cNvPicPr>
+                  </pic:nvPicPr>
+                  <pic:blipFill>
+                    <a:blip r:embed="rId16">
+                      <a:extLst>
+                        <a:ext uri="{28A0092B-C50C-407E-A947-70E740481C1C}">
+                          <a14:useLocalDpi xmlns:a14="http://schemas.microsoft.com/office/drawing/2010/main" val="0"/>
+                        </a:ext>
+                      </a:extLst>
+                    </a:blip>
+                    <a:srcRect/>
+                    <a:stretch>
+                      <a:fillRect/>
+                    </a:stretch>
+                  </pic:blipFill>
+                  <pic:spPr bwMode="auto">
+                    <a:xfrm>
+                      <a:off x="0" y="0"/>
+                      <a:ext cx="5943600" cy="2247900"/>
+                    </a:xfrm>
+                    <a:prstGeom prst="rect">
+                      <a:avLst/>
+                    </a:prstGeom>
+                    <a:noFill/>
+                    <a:ln>
+                      <a:noFill/>
+                    </a:ln>
+                  </pic:spPr>
+                </pic:pic>
+              </a:graphicData>
+            </a:graphic>
+          </wp:inline>
+        </w:drawing>
+      </w:r>
+    </w:p>
+    <w:p>
+      <w:pPr>
+        <w:rPr>
+          <w:lang w:val="en-US"/>
+        </w:rPr>
+      </w:pPr>
+      <w:r>
+        <w:rPr>
+          <w:lang w:val="en-US"/>
+        </w:rPr>
+        <w:drawing>
+          <wp:inline distT="0" distB="0" distL="0" distR="0" wp14:anchorId="5DCC95FF" wp14:editId="713108FC">
+            <wp:extent cx="2724150" cy="1038225"/>
+            <wp:effectExtent l="0" t="0" r="0" b="9525"/>
+            <wp:docPr id="666154402" name="Picture 17"/>
+            <wp:cNvGraphicFramePr>
+              <a:graphicFrameLocks xmlns:a="http://schemas.openxmlformats.org/drawingml/2006/main" noChangeAspect="1"/>
+            </wp:cNvGraphicFramePr>
+            <a:graphic xmlns:a="http://schemas.openxmlformats.org/drawingml/2006/main">
+              <a:graphicData uri="http://schemas.openxmlformats.org/drawingml/2006/picture">
+                <pic:pic xmlns:pic="http://schemas.openxmlformats.org/drawingml/2006/picture">
+                  <pic:nvPicPr>
+                    <pic:cNvPr id="0" name="Picture 47"/>
+                    <pic:cNvPicPr>
+                      <a:picLocks noChangeAspect="1" noChangeArrowheads="1"/>
+                    </pic:cNvPicPr>
+                  </pic:nvPicPr>
+                  <pic:blipFill>
+                    <a:blip r:embed="rId17">
+                      <a:extLst>
+                        <a:ext uri="{28A0092B-C50C-407E-A947-70E740481C1C}">
+                          <a14:useLocalDpi xmlns:a14="http://schemas.microsoft.com/office/drawing/2010/main" val="0"/>
+                        </a:ext>
+                      </a:extLst>
+                    </a:blip>
+                    <a:srcRect/>
+                    <a:stretch>
+                      <a:fillRect/>
+                    </a:stretch>
+                  </pic:blipFill>
+                  <pic:spPr bwMode="auto">
+                    <a:xfrm>
+                      <a:off x="0" y="0"/>
+                      <a:ext cx="2724150" cy="1038225"/>
+                    </a:xfrm>
+                    <a:prstGeom prst="rect">
+                      <a:avLst/>
+                    </a:prstGeom>
+                    <a:noFill/>
+                    <a:ln>
+                      <a:noFill/>
+                    </a:ln>
+                  </pic:spPr>
+                </pic:pic>
+              </a:graphicData>
+            </a:graphic>
+          </wp:inline>
+        </w:drawing>
+      </w:r>
+    </w:p>
+    <w:p>
+      <w:pPr>
+        <w:rPr>
+          <w:lang w:val="en-US"/>
+        </w:rPr>
+      </w:pPr>
+      <w:r>
+        <w:rPr>
+          <w:lang w:val="en-US"/>
+        </w:rPr>
+        <w:t xml:space="preserve">To communicate with all 16 temperature sensors (Sv) and get the data we want when we want, we decided to connect the I0-I15 pins of the multiplexer to the sensor cathode so we can measure the sensor </w:t>
+      </w:r>
+      <w:proofErr w:type="spellStart"/>
+      <w:r>
+        <w:rPr>
+          <w:lang w:val="en-US"/>
+        </w:rPr>
+        <w:t>Vout</w:t>
+      </w:r>
+      <w:proofErr w:type="spellEnd"/>
+      <w:r>
+        <w:rPr>
+          <w:lang w:val="en-US"/>
+        </w:rPr>
+        <w:t>, which corresponds to temperature.</w:t>
+      </w:r>
+    </w:p>
+    <w:p>
+      <w:pPr>
+        <w:rPr>
+          <w:lang w:val="en-US"/>
+        </w:rPr>
+      </w:pPr>
+      <w:r>
+        <w:rPr>
+          <w:lang w:val="en-US"/>
+        </w:rPr>
+        <w:drawing>
+          <wp:inline distT="0" distB="0" distL="0" distR="0" wp14:anchorId="0CA3323A" wp14:editId="15129F09">
+            <wp:extent cx="1704975" cy="3009900"/>
+            <wp:effectExtent l="0" t="0" r="9525" b="0"/>
+            <wp:docPr id="376569244" name="Picture 16"/>
+            <wp:cNvGraphicFramePr>
+              <a:graphicFrameLocks xmlns:a="http://schemas.openxmlformats.org/drawingml/2006/main" noChangeAspect="1"/>
+            </wp:cNvGraphicFramePr>
+            <a:graphic xmlns:a="http://schemas.openxmlformats.org/drawingml/2006/main">
+              <a:graphicData uri="http://schemas.openxmlformats.org/drawingml/2006/picture">
+                <pic:pic xmlns:pic="http://schemas.openxmlformats.org/drawingml/2006/picture">
+                  <pic:nvPicPr>
+                    <pic:cNvPr id="0" name="Picture 48"/>
+                    <pic:cNvPicPr>
+                      <a:picLocks noChangeAspect="1" noChangeArrowheads="1"/>
+                    </pic:cNvPicPr>
+                  </pic:nvPicPr>
+                  <pic:blipFill>
+                    <a:blip r:embed="rId18">
+                      <a:extLst>
+                        <a:ext uri="{28A0092B-C50C-407E-A947-70E740481C1C}">
+                          <a14:useLocalDpi xmlns:a14="http://schemas.microsoft.com/office/drawing/2010/main" val="0"/>
+                        </a:ext>
+                      </a:extLst>
+                    </a:blip>
+                    <a:srcRect/>
+                    <a:stretch>
+                      <a:fillRect/>
+                    </a:stretch>
+                  </pic:blipFill>
+                  <pic:spPr bwMode="auto">
+                    <a:xfrm>
+                      <a:off x="0" y="0"/>
+                      <a:ext cx="1704975" cy="3009900"/>
+                    </a:xfrm>
+                    <a:prstGeom prst="rect">
+                      <a:avLst/>
+                    </a:prstGeom>
+                    <a:noFill/>
+                    <a:ln>
+                      <a:noFill/>
+                    </a:ln>
+                  </pic:spPr>
+                </pic:pic>
+              </a:graphicData>
+            </a:graphic>
+          </wp:inline>
+        </w:drawing>
+      </w:r>
+    </w:p>
+    <w:p>
+      <w:pPr>
+        <w:rPr>
+          <w:lang w:val="en-US"/>
+        </w:rPr>
+      </w:pPr>
+      <w:r>
+        <w:rPr>
+          <w:lang w:val="en-US"/>
+        </w:rPr>
+        <w:t xml:space="preserve">Now in order to meet the requirement of measuring the temperature of the sensors Cn, Cn+2, Cn+4, </w:t>
+      </w:r>
+      <w:proofErr w:type="spellStart"/>
+      <w:r>
+        <w:rPr>
+          <w:lang w:val="en-US"/>
+        </w:rPr>
+        <w:t>etc</w:t>
+      </w:r>
+      <w:proofErr w:type="spellEnd"/>
+      <w:r>
+        <w:rPr>
+          <w:lang w:val="en-US"/>
+        </w:rPr>
+        <w:t xml:space="preserve"> we decided to make two sides (at least on the schematic), corresponding to one for the even sensors and one for the odd sensors; odd is left, even is right. We also decided to try to make a close replica of the Figure 6 diagram in the temperature sensor data sheet; however, because we couldn't vertically stack 16, we had to improvise by splitting it as you see.</w:t>
+      </w:r>
+    </w:p>
+    <w:p>
+      <w:pPr>
+        <w:rPr>
+          <w:lang w:val="en-US"/>
+        </w:rPr>
+      </w:pPr>
+      <w:r>
+        <w:rPr>
+          <w:lang w:val="en-US"/>
+        </w:rPr>
+        <w:lastRenderedPageBreak/>
+        <w:drawing>
+          <wp:inline distT="0" distB="0" distL="0" distR="0" wp14:anchorId="6BCAA5B2" wp14:editId="41AE7522">
+            <wp:extent cx="2286000" cy="4105275"/>
+            <wp:effectExtent l="0" t="0" r="0" b="9525"/>
+            <wp:docPr id="1476184952" name="Picture 15"/>
+            <wp:cNvGraphicFramePr>
+              <a:graphicFrameLocks xmlns:a="http://schemas.openxmlformats.org/drawingml/2006/main" noChangeAspect="1"/>
+            </wp:cNvGraphicFramePr>
+            <a:graphic xmlns:a="http://schemas.openxmlformats.org/drawingml/2006/main">
+              <a:graphicData uri="http://schemas.openxmlformats.org/drawingml/2006/picture">
+                <pic:pic xmlns:pic="http://schemas.openxmlformats.org/drawingml/2006/picture">
+                  <pic:nvPicPr>
+                    <pic:cNvPr id="0" name="Picture 49"/>
+                    <pic:cNvPicPr>
+                      <a:picLocks noChangeAspect="1" noChangeArrowheads="1"/>
+                    </pic:cNvPicPr>
+                  </pic:nvPicPr>
+                  <pic:blipFill>
+                    <a:blip r:embed="rId19">
+                      <a:extLst>
+                        <a:ext uri="{28A0092B-C50C-407E-A947-70E740481C1C}">
+                          <a14:useLocalDpi xmlns:a14="http://schemas.microsoft.com/office/drawing/2010/main" val="0"/>
+                        </a:ext>
+                      </a:extLst>
+                    </a:blip>
+                    <a:srcRect/>
+                    <a:stretch>
+                      <a:fillRect/>
+                    </a:stretch>
+                  </pic:blipFill>
+                  <pic:spPr bwMode="auto">
+                    <a:xfrm>
+                      <a:off x="0" y="0"/>
+                      <a:ext cx="2286000" cy="4105275"/>
+                    </a:xfrm>
+                    <a:prstGeom prst="rect">
+                      <a:avLst/>
+                    </a:prstGeom>
+                    <a:noFill/>
+                    <a:ln>
+                      <a:noFill/>
+                    </a:ln>
+                  </pic:spPr>
+                </pic:pic>
+              </a:graphicData>
+            </a:graphic>
+          </wp:inline>
+        </w:drawing>
+      </w:r>
+    </w:p>
+    <w:p>
+      <w:pPr>
+        <w:rPr>
+          <w:lang w:val="en-US"/>
+        </w:rPr>
+      </w:pPr>
+      <w:r>
+        <w:rPr>
+          <w:lang w:val="en-US"/>
+        </w:rPr>
+        <w:lastRenderedPageBreak/>
+        <w:drawing>
+          <wp:inline distT="0" distB="0" distL="0" distR="0" wp14:anchorId="58439A92" wp14:editId="0922A868">
+            <wp:extent cx="3600450" cy="4905375"/>
+            <wp:effectExtent l="0" t="0" r="0" b="9525"/>
+            <wp:docPr id="98563367" name="Picture 14"/>
+            <wp:cNvGraphicFramePr>
+              <a:graphicFrameLocks xmlns:a="http://schemas.openxmlformats.org/drawingml/2006/main" noChangeAspect="1"/>
+            </wp:cNvGraphicFramePr>
+            <a:graphic xmlns:a="http://schemas.openxmlformats.org/drawingml/2006/main">
+              <a:graphicData uri="http://schemas.openxmlformats.org/drawingml/2006/picture">
+                <pic:pic xmlns:pic="http://schemas.openxmlformats.org/drawingml/2006/picture">
+                  <pic:nvPicPr>
+                    <pic:cNvPr id="0" name="Picture 50"/>
+                    <pic:cNvPicPr>
+                      <a:picLocks noChangeAspect="1" noChangeArrowheads="1"/>
+                    </pic:cNvPicPr>
+                  </pic:nvPicPr>
+                  <pic:blipFill>
+                    <a:blip r:embed="rId20">
+                      <a:extLst>
+                        <a:ext uri="{28A0092B-C50C-407E-A947-70E740481C1C}">
+                          <a14:useLocalDpi xmlns:a14="http://schemas.microsoft.com/office/drawing/2010/main" val="0"/>
+                        </a:ext>
+                      </a:extLst>
+                    </a:blip>
+                    <a:srcRect/>
+                    <a:stretch>
+                      <a:fillRect/>
+                    </a:stretch>
+                  </pic:blipFill>
+                  <pic:spPr bwMode="auto">
+                    <a:xfrm>
+                      <a:off x="0" y="0"/>
+                      <a:ext cx="3600450" cy="4905375"/>
+                    </a:xfrm>
+                    <a:prstGeom prst="rect">
+                      <a:avLst/>
+                    </a:prstGeom>
+                    <a:noFill/>
+                    <a:ln>
+                      <a:noFill/>
+                    </a:ln>
+                  </pic:spPr>
+                </pic:pic>
+              </a:graphicData>
+            </a:graphic>
+          </wp:inline>
+        </w:drawing>
+      </w:r>
+    </w:p>
+    <w:p>
+      <w:pPr>
+        <w:rPr>
+          <w:lang w:val="en-US"/>
+        </w:rPr>
+      </w:pPr>
+    </w:p>
+    <w:p>
+      <w:pPr>
+        <w:rPr>
+          <w:lang w:val="en-US"/>
+        </w:rPr>
+      </w:pPr>
+      <w:r>
+        <w:rPr>
+          <w:lang w:val="en-US"/>
+        </w:rPr>
+        <w:t xml:space="preserve">The only difference between the two sides is that the drain gate of the MOSFETs on the odd and even sides </w:t>
+      </w:r>
+      <w:proofErr w:type="gramStart"/>
+      <w:r>
+        <w:rPr>
+          <w:lang w:val="en-US"/>
+        </w:rPr>
+        <w:t>is</w:t>
+      </w:r>
+      <w:proofErr w:type="gramEnd"/>
+      <w:r>
+        <w:rPr>
+          <w:lang w:val="en-US"/>
+        </w:rPr>
+        <w:t xml:space="preserve"> powered by the Arduino's D7 and D8 pins, respectively. And </w:t>
+      </w:r>
+      <w:proofErr w:type="gramStart"/>
+      <w:r>
+        <w:rPr>
+          <w:lang w:val="en-US"/>
+        </w:rPr>
+        <w:t>in order to</w:t>
+      </w:r>
+      <w:proofErr w:type="gramEnd"/>
+      <w:r>
+        <w:rPr>
+          <w:lang w:val="en-US"/>
+        </w:rPr>
+        <w:t xml:space="preserve"> meet the requirement of 200mA or less directed </w:t>
+      </w:r>
+      <w:proofErr w:type="gramStart"/>
+      <w:r>
+        <w:rPr>
+          <w:lang w:val="en-US"/>
+        </w:rPr>
+        <w:t>to</w:t>
+      </w:r>
+      <w:proofErr w:type="gramEnd"/>
+      <w:r>
+        <w:rPr>
+          <w:lang w:val="en-US"/>
+        </w:rPr>
+        <w:t xml:space="preserve"> the drain gates of the MOSFETs, there is a </w:t>
+      </w:r>
+      <w:proofErr w:type="gramStart"/>
+      <w:r>
+        <w:rPr>
+          <w:lang w:val="en-US"/>
+        </w:rPr>
+        <w:t>100 ohm</w:t>
+      </w:r>
+      <w:proofErr w:type="gramEnd"/>
+      <w:r>
+        <w:rPr>
+          <w:lang w:val="en-US"/>
+        </w:rPr>
+        <w:t xml:space="preserve"> resistor from pins D7 and D8</w:t>
+      </w:r>
+    </w:p>
+    <w:p>
+      <w:pPr>
+        <w:rPr>
+          <w:lang w:val="en-US"/>
+        </w:rPr>
+      </w:pPr>
+      <w:r>
+        <w:rPr>
+          <w:lang w:val="en-US"/>
+        </w:rPr>
+        <w:drawing>
+          <wp:inline distT="0" distB="0" distL="0" distR="0" wp14:anchorId="348DA516" wp14:editId="0D7FF683">
+            <wp:extent cx="4171950" cy="1323975"/>
+            <wp:effectExtent l="0" t="0" r="0" b="9525"/>
+            <wp:docPr id="624017610" name="Picture 13"/>
+            <wp:cNvGraphicFramePr>
+              <a:graphicFrameLocks xmlns:a="http://schemas.openxmlformats.org/drawingml/2006/main" noChangeAspect="1"/>
+            </wp:cNvGraphicFramePr>
+            <a:graphic xmlns:a="http://schemas.openxmlformats.org/drawingml/2006/main">
+              <a:graphicData uri="http://schemas.openxmlformats.org/drawingml/2006/picture">
+                <pic:pic xmlns:pic="http://schemas.openxmlformats.org/drawingml/2006/picture">
+                  <pic:nvPicPr>
+                    <pic:cNvPr id="0" name="Picture 51"/>
+                    <pic:cNvPicPr>
+                      <a:picLocks noChangeAspect="1" noChangeArrowheads="1"/>
+                    </pic:cNvPicPr>
+                  </pic:nvPicPr>
+                  <pic:blipFill>
+                    <a:blip r:embed="rId21">
+                      <a:extLst>
+                        <a:ext uri="{28A0092B-C50C-407E-A947-70E740481C1C}">
+                          <a14:useLocalDpi xmlns:a14="http://schemas.microsoft.com/office/drawing/2010/main" val="0"/>
+                        </a:ext>
+                      </a:extLst>
+                    </a:blip>
+                    <a:srcRect/>
+                    <a:stretch>
+                      <a:fillRect/>
+                    </a:stretch>
+                  </pic:blipFill>
+                  <pic:spPr bwMode="auto">
+                    <a:xfrm>
+                      <a:off x="0" y="0"/>
+                      <a:ext cx="4171950" cy="1323975"/>
+                    </a:xfrm>
+                    <a:prstGeom prst="rect">
+                      <a:avLst/>
+                    </a:prstGeom>
+                    <a:noFill/>
+                    <a:ln>
+                      <a:noFill/>
+                    </a:ln>
+                  </pic:spPr>
+                </pic:pic>
+              </a:graphicData>
+            </a:graphic>
+          </wp:inline>
+        </w:drawing>
+      </w:r>
+    </w:p>
+    <w:p>
+      <w:pPr>
+        <w:rPr>
+          <w:lang w:val="en-US"/>
+        </w:rPr>
+      </w:pPr>
+    </w:p>
+    <w:p>
+      <w:pPr>
+        <w:rPr>
+          <w:lang w:val="en-US"/>
+        </w:rPr>
+      </w:pPr>
+      <w:r>
+        <w:rPr>
+          <w:lang w:val="en-US"/>
+        </w:rPr>
+        <w:t xml:space="preserve">Now we still need a way for the Arduino and Multiplexer to communicate; the clearest and easiest way we found was for pins D2-D5 of the Arduino to connect to pins S0-S3 of the multiplexer. This works because the I0-I15 pins correspond to the digital states of S0-S3 on the multiplexer, which selects which sensor’s data we want and sends it back to the Arduino via an </w:t>
+      </w:r>
+      <w:r>
+        <w:rPr>
+          <w:lang w:val="en-US"/>
+        </w:rPr>
+        <w:lastRenderedPageBreak/>
+        <w:t>analog pin (C I/O to A0). Then we would send that data via I2C from the Arduino to the receiving device through pin A4, as it's the SDA pin. </w:t>
+      </w:r>
+    </w:p>
+    <w:p>
+      <w:pPr>
+        <w:rPr>
+          <w:lang w:val="en-US"/>
+        </w:rPr>
+      </w:pPr>
+    </w:p>
+    <w:p>
+      <w:pPr>
+        <w:rPr>
+          <w:lang w:val="en-US"/>
+        </w:rPr>
+      </w:pPr>
+      <w:r>
+        <w:rPr>
+          <w:lang w:val="en-US"/>
+        </w:rPr>
+        <w:drawing>
+          <wp:inline distT="0" distB="0" distL="0" distR="0" wp14:anchorId="390312DC" wp14:editId="00FABE4B">
+            <wp:extent cx="2095500" cy="942975"/>
+            <wp:effectExtent l="0" t="0" r="0" b="9525"/>
+            <wp:docPr id="2005785303" name="Picture 12"/>
+            <wp:cNvGraphicFramePr>
+              <a:graphicFrameLocks xmlns:a="http://schemas.openxmlformats.org/drawingml/2006/main" noChangeAspect="1"/>
+            </wp:cNvGraphicFramePr>
+            <a:graphic xmlns:a="http://schemas.openxmlformats.org/drawingml/2006/main">
+              <a:graphicData uri="http://schemas.openxmlformats.org/drawingml/2006/picture">
+                <pic:pic xmlns:pic="http://schemas.openxmlformats.org/drawingml/2006/picture">
+                  <pic:nvPicPr>
+                    <pic:cNvPr id="0" name="Picture 52"/>
+                    <pic:cNvPicPr>
+                      <a:picLocks noChangeAspect="1" noChangeArrowheads="1"/>
+                    </pic:cNvPicPr>
+                  </pic:nvPicPr>
+                  <pic:blipFill>
+                    <a:blip r:embed="rId22">
+                      <a:extLst>
+                        <a:ext uri="{28A0092B-C50C-407E-A947-70E740481C1C}">
+                          <a14:useLocalDpi xmlns:a14="http://schemas.microsoft.com/office/drawing/2010/main" val="0"/>
+                        </a:ext>
+                      </a:extLst>
+                    </a:blip>
+                    <a:srcRect/>
+                    <a:stretch>
+                      <a:fillRect/>
+                    </a:stretch>
+                  </pic:blipFill>
+                  <pic:spPr bwMode="auto">
+                    <a:xfrm>
+                      <a:off x="0" y="0"/>
+                      <a:ext cx="2095500" cy="942975"/>
+                    </a:xfrm>
+                    <a:prstGeom prst="rect">
+                      <a:avLst/>
+                    </a:prstGeom>
+                    <a:noFill/>
+                    <a:ln>
+                      <a:noFill/>
+                    </a:ln>
+                  </pic:spPr>
+                </pic:pic>
+              </a:graphicData>
+            </a:graphic>
+          </wp:inline>
+        </w:drawing>
+      </w:r>
+      <w:r>
+        <w:rPr>
+          <w:lang w:val="en-US"/>
+        </w:rPr>
+        <w:drawing>
+          <wp:inline distT="0" distB="0" distL="0" distR="0" wp14:anchorId="45F761E8" wp14:editId="0EB8BB47">
+            <wp:extent cx="3248025" cy="3505200"/>
+            <wp:effectExtent l="0" t="0" r="9525" b="0"/>
+            <wp:docPr id="773844207" name="Picture 11"/>
+            <wp:cNvGraphicFramePr>
+              <a:graphicFrameLocks xmlns:a="http://schemas.openxmlformats.org/drawingml/2006/main" noChangeAspect="1"/>
+            </wp:cNvGraphicFramePr>
+            <a:graphic xmlns:a="http://schemas.openxmlformats.org/drawingml/2006/main">
+              <a:graphicData uri="http://schemas.openxmlformats.org/drawingml/2006/picture">
+                <pic:pic xmlns:pic="http://schemas.openxmlformats.org/drawingml/2006/picture">
+                  <pic:nvPicPr>
+                    <pic:cNvPr id="0" name="Picture 53"/>
+                    <pic:cNvPicPr>
+                      <a:picLocks noChangeAspect="1" noChangeArrowheads="1"/>
+                    </pic:cNvPicPr>
+                  </pic:nvPicPr>
+                  <pic:blipFill>
+                    <a:blip r:embed="rId23">
+                      <a:extLst>
+                        <a:ext uri="{28A0092B-C50C-407E-A947-70E740481C1C}">
+                          <a14:useLocalDpi xmlns:a14="http://schemas.microsoft.com/office/drawing/2010/main" val="0"/>
+                        </a:ext>
+                      </a:extLst>
+                    </a:blip>
+                    <a:srcRect/>
+                    <a:stretch>
+                      <a:fillRect/>
+                    </a:stretch>
+                  </pic:blipFill>
+                  <pic:spPr bwMode="auto">
+                    <a:xfrm>
+                      <a:off x="0" y="0"/>
+                      <a:ext cx="3248025" cy="3505200"/>
+                    </a:xfrm>
+                    <a:prstGeom prst="rect">
+                      <a:avLst/>
+                    </a:prstGeom>
+                    <a:noFill/>
+                    <a:ln>
+                      <a:noFill/>
+                    </a:ln>
+                  </pic:spPr>
+                </pic:pic>
+              </a:graphicData>
+            </a:graphic>
+          </wp:inline>
+        </w:drawing>
+      </w:r>
+    </w:p>
+    <w:p>
+      <w:pPr>
+        <w:rPr>
+          <w:lang w:val="en-US"/>
+        </w:rPr>
+      </w:pPr>
+      <w:r>
+        <w:rPr>
+          <w:lang w:val="en-US"/>
+        </w:rPr>
+        <w:drawing>
+          <wp:inline distT="0" distB="0" distL="0" distR="0" wp14:anchorId="3E73CEE8" wp14:editId="27596988">
+            <wp:extent cx="2771775" cy="1352550"/>
+            <wp:effectExtent l="0" t="0" r="9525" b="0"/>
+            <wp:docPr id="1808714333" name="Picture 10"/>
+            <wp:cNvGraphicFramePr>
+              <a:graphicFrameLocks xmlns:a="http://schemas.openxmlformats.org/drawingml/2006/main" noChangeAspect="1"/>
+            </wp:cNvGraphicFramePr>
+            <a:graphic xmlns:a="http://schemas.openxmlformats.org/drawingml/2006/main">
+              <a:graphicData uri="http://schemas.openxmlformats.org/drawingml/2006/picture">
+                <pic:pic xmlns:pic="http://schemas.openxmlformats.org/drawingml/2006/picture">
+                  <pic:nvPicPr>
+                    <pic:cNvPr id="0" name="Picture 54"/>
+                    <pic:cNvPicPr>
+                      <a:picLocks noChangeAspect="1" noChangeArrowheads="1"/>
+                    </pic:cNvPicPr>
+                  </pic:nvPicPr>
+                  <pic:blipFill>
+                    <a:blip r:embed="rId24">
+                      <a:extLst>
+                        <a:ext uri="{28A0092B-C50C-407E-A947-70E740481C1C}">
+                          <a14:useLocalDpi xmlns:a14="http://schemas.microsoft.com/office/drawing/2010/main" val="0"/>
+                        </a:ext>
+                      </a:extLst>
+                    </a:blip>
+                    <a:srcRect/>
+                    <a:stretch>
+                      <a:fillRect/>
+                    </a:stretch>
+                  </pic:blipFill>
+                  <pic:spPr bwMode="auto">
+                    <a:xfrm>
+                      <a:off x="0" y="0"/>
+                      <a:ext cx="2771775" cy="1352550"/>
+                    </a:xfrm>
+                    <a:prstGeom prst="rect">
+                      <a:avLst/>
+                    </a:prstGeom>
+                    <a:noFill/>
+                    <a:ln>
+                      <a:noFill/>
+                    </a:ln>
+                  </pic:spPr>
+                </pic:pic>
+              </a:graphicData>
+            </a:graphic>
+          </wp:inline>
+        </w:drawing>
       </w:r>
     </w:p>
     <w:p/>
@@ -1351,6 +2880,155 @@
     </w:lvl>
   </w:abstractNum>
   <w:abstractNum w:abstractNumId="1" w15:restartNumberingAfterBreak="0">
+    <w:nsid w:val="041F3CDE"/>
+    <w:multiLevelType w:val="multilevel"/>
+    <w:tmpl w:val="97981A9A"/>
+    <w:lvl w:ilvl="0">
+      <w:start w:val="1"/>
+      <w:numFmt w:val="bullet"/>
+      <w:lvlText w:val=""/>
+      <w:lvlJc w:val="left"/>
+      <w:pPr>
+        <w:tabs>
+          <w:tab w:val="num" w:pos="720"/>
+        </w:tabs>
+        <w:ind w:left="720" w:hanging="360"/>
+      </w:pPr>
+      <w:rPr>
+        <w:rFonts w:ascii="Symbol" w:hAnsi="Symbol" w:hint="default"/>
+        <w:sz w:val="20"/>
+      </w:rPr>
+    </w:lvl>
+    <w:lvl w:ilvl="1" w:tentative="1">
+      <w:start w:val="1"/>
+      <w:numFmt w:val="bullet"/>
+      <w:lvlText w:val="o"/>
+      <w:lvlJc w:val="left"/>
+      <w:pPr>
+        <w:tabs>
+          <w:tab w:val="num" w:pos="1440"/>
+        </w:tabs>
+        <w:ind w:left="1440" w:hanging="360"/>
+      </w:pPr>
+      <w:rPr>
+        <w:rFonts w:ascii="Courier New" w:hAnsi="Courier New" w:hint="default"/>
+        <w:sz w:val="20"/>
+      </w:rPr>
+    </w:lvl>
+    <w:lvl w:ilvl="2" w:tentative="1">
+      <w:start w:val="1"/>
+      <w:numFmt w:val="bullet"/>
+      <w:lvlText w:val=""/>
+      <w:lvlJc w:val="left"/>
+      <w:pPr>
+        <w:tabs>
+          <w:tab w:val="num" w:pos="2160"/>
+        </w:tabs>
+        <w:ind w:left="2160" w:hanging="360"/>
+      </w:pPr>
+      <w:rPr>
+        <w:rFonts w:ascii="Wingdings" w:hAnsi="Wingdings" w:hint="default"/>
+        <w:sz w:val="20"/>
+      </w:rPr>
+    </w:lvl>
+    <w:lvl w:ilvl="3" w:tentative="1">
+      <w:start w:val="1"/>
+      <w:numFmt w:val="bullet"/>
+      <w:lvlText w:val=""/>
+      <w:lvlJc w:val="left"/>
+      <w:pPr>
+        <w:tabs>
+          <w:tab w:val="num" w:pos="2880"/>
+        </w:tabs>
+        <w:ind w:left="2880" w:hanging="360"/>
+      </w:pPr>
+      <w:rPr>
+        <w:rFonts w:ascii="Wingdings" w:hAnsi="Wingdings" w:hint="default"/>
+        <w:sz w:val="20"/>
+      </w:rPr>
+    </w:lvl>
+    <w:lvl w:ilvl="4" w:tentative="1">
+      <w:start w:val="1"/>
+      <w:numFmt w:val="bullet"/>
+      <w:lvlText w:val=""/>
+      <w:lvlJc w:val="left"/>
+      <w:pPr>
+        <w:tabs>
+          <w:tab w:val="num" w:pos="3600"/>
+        </w:tabs>
+        <w:ind w:left="3600" w:hanging="360"/>
+      </w:pPr>
+      <w:rPr>
+        <w:rFonts w:ascii="Wingdings" w:hAnsi="Wingdings" w:hint="default"/>
+        <w:sz w:val="20"/>
+      </w:rPr>
+    </w:lvl>
+    <w:lvl w:ilvl="5" w:tentative="1">
+      <w:start w:val="1"/>
+      <w:numFmt w:val="bullet"/>
+      <w:lvlText w:val=""/>
+      <w:lvlJc w:val="left"/>
+      <w:pPr>
+        <w:tabs>
+          <w:tab w:val="num" w:pos="4320"/>
+        </w:tabs>
+        <w:ind w:left="4320" w:hanging="360"/>
+      </w:pPr>
+      <w:rPr>
+        <w:rFonts w:ascii="Wingdings" w:hAnsi="Wingdings" w:hint="default"/>
+        <w:sz w:val="20"/>
+      </w:rPr>
+    </w:lvl>
+    <w:lvl w:ilvl="6" w:tentative="1">
+      <w:start w:val="1"/>
+      <w:numFmt w:val="bullet"/>
+      <w:lvlText w:val=""/>
+      <w:lvlJc w:val="left"/>
+      <w:pPr>
+        <w:tabs>
+          <w:tab w:val="num" w:pos="5040"/>
+        </w:tabs>
+        <w:ind w:left="5040" w:hanging="360"/>
+      </w:pPr>
+      <w:rPr>
+        <w:rFonts w:ascii="Wingdings" w:hAnsi="Wingdings" w:hint="default"/>
+        <w:sz w:val="20"/>
+      </w:rPr>
+    </w:lvl>
+    <w:lvl w:ilvl="7" w:tentative="1">
+      <w:start w:val="1"/>
+      <w:numFmt w:val="bullet"/>
+      <w:lvlText w:val=""/>
+      <w:lvlJc w:val="left"/>
+      <w:pPr>
+        <w:tabs>
+          <w:tab w:val="num" w:pos="5760"/>
+        </w:tabs>
+        <w:ind w:left="5760" w:hanging="360"/>
+      </w:pPr>
+      <w:rPr>
+        <w:rFonts w:ascii="Wingdings" w:hAnsi="Wingdings" w:hint="default"/>
+        <w:sz w:val="20"/>
+      </w:rPr>
+    </w:lvl>
+    <w:lvl w:ilvl="8" w:tentative="1">
+      <w:start w:val="1"/>
+      <w:numFmt w:val="bullet"/>
+      <w:lvlText w:val=""/>
+      <w:lvlJc w:val="left"/>
+      <w:pPr>
+        <w:tabs>
+          <w:tab w:val="num" w:pos="6480"/>
+        </w:tabs>
+        <w:ind w:left="6480" w:hanging="360"/>
+      </w:pPr>
+      <w:rPr>
+        <w:rFonts w:ascii="Wingdings" w:hAnsi="Wingdings" w:hint="default"/>
+        <w:sz w:val="20"/>
+      </w:rPr>
+    </w:lvl>
+  </w:abstractNum>
+  <w:abstractNum w:abstractNumId="2" w15:restartNumberingAfterBreak="0">
     <w:nsid w:val="09C03D0F"/>
     <w:multiLevelType w:val="multilevel"/>
     <w:tmpl w:val="2C2ABCB2"/>
@@ -1499,7 +3177,305 @@
       </w:rPr>
     </w:lvl>
   </w:abstractNum>
-  <w:abstractNum w:abstractNumId="2" w15:restartNumberingAfterBreak="0">
+  <w:abstractNum w:abstractNumId="3" w15:restartNumberingAfterBreak="0">
+    <w:nsid w:val="0E7712C1"/>
+    <w:multiLevelType w:val="multilevel"/>
+    <w:tmpl w:val="45FA0768"/>
+    <w:lvl w:ilvl="0">
+      <w:start w:val="1"/>
+      <w:numFmt w:val="bullet"/>
+      <w:lvlText w:val=""/>
+      <w:lvlJc w:val="left"/>
+      <w:pPr>
+        <w:tabs>
+          <w:tab w:val="num" w:pos="720"/>
+        </w:tabs>
+        <w:ind w:left="720" w:hanging="360"/>
+      </w:pPr>
+      <w:rPr>
+        <w:rFonts w:ascii="Symbol" w:hAnsi="Symbol" w:hint="default"/>
+        <w:sz w:val="20"/>
+      </w:rPr>
+    </w:lvl>
+    <w:lvl w:ilvl="1" w:tentative="1">
+      <w:start w:val="1"/>
+      <w:numFmt w:val="bullet"/>
+      <w:lvlText w:val="o"/>
+      <w:lvlJc w:val="left"/>
+      <w:pPr>
+        <w:tabs>
+          <w:tab w:val="num" w:pos="1440"/>
+        </w:tabs>
+        <w:ind w:left="1440" w:hanging="360"/>
+      </w:pPr>
+      <w:rPr>
+        <w:rFonts w:ascii="Courier New" w:hAnsi="Courier New" w:hint="default"/>
+        <w:sz w:val="20"/>
+      </w:rPr>
+    </w:lvl>
+    <w:lvl w:ilvl="2" w:tentative="1">
+      <w:start w:val="1"/>
+      <w:numFmt w:val="bullet"/>
+      <w:lvlText w:val=""/>
+      <w:lvlJc w:val="left"/>
+      <w:pPr>
+        <w:tabs>
+          <w:tab w:val="num" w:pos="2160"/>
+        </w:tabs>
+        <w:ind w:left="2160" w:hanging="360"/>
+      </w:pPr>
+      <w:rPr>
+        <w:rFonts w:ascii="Wingdings" w:hAnsi="Wingdings" w:hint="default"/>
+        <w:sz w:val="20"/>
+      </w:rPr>
+    </w:lvl>
+    <w:lvl w:ilvl="3" w:tentative="1">
+      <w:start w:val="1"/>
+      <w:numFmt w:val="bullet"/>
+      <w:lvlText w:val=""/>
+      <w:lvlJc w:val="left"/>
+      <w:pPr>
+        <w:tabs>
+          <w:tab w:val="num" w:pos="2880"/>
+        </w:tabs>
+        <w:ind w:left="2880" w:hanging="360"/>
+      </w:pPr>
+      <w:rPr>
+        <w:rFonts w:ascii="Wingdings" w:hAnsi="Wingdings" w:hint="default"/>
+        <w:sz w:val="20"/>
+      </w:rPr>
+    </w:lvl>
+    <w:lvl w:ilvl="4" w:tentative="1">
+      <w:start w:val="1"/>
+      <w:numFmt w:val="bullet"/>
+      <w:lvlText w:val=""/>
+      <w:lvlJc w:val="left"/>
+      <w:pPr>
+        <w:tabs>
+          <w:tab w:val="num" w:pos="3600"/>
+        </w:tabs>
+        <w:ind w:left="3600" w:hanging="360"/>
+      </w:pPr>
+      <w:rPr>
+        <w:rFonts w:ascii="Wingdings" w:hAnsi="Wingdings" w:hint="default"/>
+        <w:sz w:val="20"/>
+      </w:rPr>
+    </w:lvl>
+    <w:lvl w:ilvl="5" w:tentative="1">
+      <w:start w:val="1"/>
+      <w:numFmt w:val="bullet"/>
+      <w:lvlText w:val=""/>
+      <w:lvlJc w:val="left"/>
+      <w:pPr>
+        <w:tabs>
+          <w:tab w:val="num" w:pos="4320"/>
+        </w:tabs>
+        <w:ind w:left="4320" w:hanging="360"/>
+      </w:pPr>
+      <w:rPr>
+        <w:rFonts w:ascii="Wingdings" w:hAnsi="Wingdings" w:hint="default"/>
+        <w:sz w:val="20"/>
+      </w:rPr>
+    </w:lvl>
+    <w:lvl w:ilvl="6" w:tentative="1">
+      <w:start w:val="1"/>
+      <w:numFmt w:val="bullet"/>
+      <w:lvlText w:val=""/>
+      <w:lvlJc w:val="left"/>
+      <w:pPr>
+        <w:tabs>
+          <w:tab w:val="num" w:pos="5040"/>
+        </w:tabs>
+        <w:ind w:left="5040" w:hanging="360"/>
+      </w:pPr>
+      <w:rPr>
+        <w:rFonts w:ascii="Wingdings" w:hAnsi="Wingdings" w:hint="default"/>
+        <w:sz w:val="20"/>
+      </w:rPr>
+    </w:lvl>
+    <w:lvl w:ilvl="7" w:tentative="1">
+      <w:start w:val="1"/>
+      <w:numFmt w:val="bullet"/>
+      <w:lvlText w:val=""/>
+      <w:lvlJc w:val="left"/>
+      <w:pPr>
+        <w:tabs>
+          <w:tab w:val="num" w:pos="5760"/>
+        </w:tabs>
+        <w:ind w:left="5760" w:hanging="360"/>
+      </w:pPr>
+      <w:rPr>
+        <w:rFonts w:ascii="Wingdings" w:hAnsi="Wingdings" w:hint="default"/>
+        <w:sz w:val="20"/>
+      </w:rPr>
+    </w:lvl>
+    <w:lvl w:ilvl="8" w:tentative="1">
+      <w:start w:val="1"/>
+      <w:numFmt w:val="bullet"/>
+      <w:lvlText w:val=""/>
+      <w:lvlJc w:val="left"/>
+      <w:pPr>
+        <w:tabs>
+          <w:tab w:val="num" w:pos="6480"/>
+        </w:tabs>
+        <w:ind w:left="6480" w:hanging="360"/>
+      </w:pPr>
+      <w:rPr>
+        <w:rFonts w:ascii="Wingdings" w:hAnsi="Wingdings" w:hint="default"/>
+        <w:sz w:val="20"/>
+      </w:rPr>
+    </w:lvl>
+  </w:abstractNum>
+  <w:abstractNum w:abstractNumId="4" w15:restartNumberingAfterBreak="0">
+    <w:nsid w:val="1D2A1723"/>
+    <w:multiLevelType w:val="multilevel"/>
+    <w:tmpl w:val="A6767F36"/>
+    <w:lvl w:ilvl="0">
+      <w:start w:val="1"/>
+      <w:numFmt w:val="bullet"/>
+      <w:lvlText w:val=""/>
+      <w:lvlJc w:val="left"/>
+      <w:pPr>
+        <w:tabs>
+          <w:tab w:val="num" w:pos="720"/>
+        </w:tabs>
+        <w:ind w:left="720" w:hanging="360"/>
+      </w:pPr>
+      <w:rPr>
+        <w:rFonts w:ascii="Symbol" w:hAnsi="Symbol" w:hint="default"/>
+        <w:sz w:val="20"/>
+      </w:rPr>
+    </w:lvl>
+    <w:lvl w:ilvl="1">
+      <w:start w:val="1"/>
+      <w:numFmt w:val="bullet"/>
+      <w:lvlText w:val="o"/>
+      <w:lvlJc w:val="left"/>
+      <w:pPr>
+        <w:tabs>
+          <w:tab w:val="num" w:pos="1440"/>
+        </w:tabs>
+        <w:ind w:left="1440" w:hanging="360"/>
+      </w:pPr>
+      <w:rPr>
+        <w:rFonts w:ascii="Courier New" w:hAnsi="Courier New" w:hint="default"/>
+        <w:sz w:val="20"/>
+      </w:rPr>
+    </w:lvl>
+    <w:lvl w:ilvl="2" w:tentative="1">
+      <w:start w:val="1"/>
+      <w:numFmt w:val="bullet"/>
+      <w:lvlText w:val=""/>
+      <w:lvlJc w:val="left"/>
+      <w:pPr>
+        <w:tabs>
+          <w:tab w:val="num" w:pos="2160"/>
+        </w:tabs>
+        <w:ind w:left="2160" w:hanging="360"/>
+      </w:pPr>
+      <w:rPr>
+        <w:rFonts w:ascii="Wingdings" w:hAnsi="Wingdings" w:hint="default"/>
+        <w:sz w:val="20"/>
+      </w:rPr>
+    </w:lvl>
+    <w:lvl w:ilvl="3" w:tentative="1">
+      <w:start w:val="1"/>
+      <w:numFmt w:val="bullet"/>
+      <w:lvlText w:val=""/>
+      <w:lvlJc w:val="left"/>
+      <w:pPr>
+        <w:tabs>
+          <w:tab w:val="num" w:pos="2880"/>
+        </w:tabs>
+        <w:ind w:left="2880" w:hanging="360"/>
+      </w:pPr>
+      <w:rPr>
+        <w:rFonts w:ascii="Wingdings" w:hAnsi="Wingdings" w:hint="default"/>
+        <w:sz w:val="20"/>
+      </w:rPr>
+    </w:lvl>
+    <w:lvl w:ilvl="4" w:tentative="1">
+      <w:start w:val="1"/>
+      <w:numFmt w:val="bullet"/>
+      <w:lvlText w:val=""/>
+      <w:lvlJc w:val="left"/>
+      <w:pPr>
+        <w:tabs>
+          <w:tab w:val="num" w:pos="3600"/>
+        </w:tabs>
+        <w:ind w:left="3600" w:hanging="360"/>
+      </w:pPr>
+      <w:rPr>
+        <w:rFonts w:ascii="Wingdings" w:hAnsi="Wingdings" w:hint="default"/>
+        <w:sz w:val="20"/>
+      </w:rPr>
+    </w:lvl>
+    <w:lvl w:ilvl="5" w:tentative="1">
+      <w:start w:val="1"/>
+      <w:numFmt w:val="bullet"/>
+      <w:lvlText w:val=""/>
+      <w:lvlJc w:val="left"/>
+      <w:pPr>
+        <w:tabs>
+          <w:tab w:val="num" w:pos="4320"/>
+        </w:tabs>
+        <w:ind w:left="4320" w:hanging="360"/>
+      </w:pPr>
+      <w:rPr>
+        <w:rFonts w:ascii="Wingdings" w:hAnsi="Wingdings" w:hint="default"/>
+        <w:sz w:val="20"/>
+      </w:rPr>
+    </w:lvl>
+    <w:lvl w:ilvl="6" w:tentative="1">
+      <w:start w:val="1"/>
+      <w:numFmt w:val="bullet"/>
+      <w:lvlText w:val=""/>
+      <w:lvlJc w:val="left"/>
+      <w:pPr>
+        <w:tabs>
+          <w:tab w:val="num" w:pos="5040"/>
+        </w:tabs>
+        <w:ind w:left="5040" w:hanging="360"/>
+      </w:pPr>
+      <w:rPr>
+        <w:rFonts w:ascii="Wingdings" w:hAnsi="Wingdings" w:hint="default"/>
+        <w:sz w:val="20"/>
+      </w:rPr>
+    </w:lvl>
+    <w:lvl w:ilvl="7" w:tentative="1">
+      <w:start w:val="1"/>
+      <w:numFmt w:val="bullet"/>
+      <w:lvlText w:val=""/>
+      <w:lvlJc w:val="left"/>
+      <w:pPr>
+        <w:tabs>
+          <w:tab w:val="num" w:pos="5760"/>
+        </w:tabs>
+        <w:ind w:left="5760" w:hanging="360"/>
+      </w:pPr>
+      <w:rPr>
+        <w:rFonts w:ascii="Wingdings" w:hAnsi="Wingdings" w:hint="default"/>
+        <w:sz w:val="20"/>
+      </w:rPr>
+    </w:lvl>
+    <w:lvl w:ilvl="8" w:tentative="1">
+      <w:start w:val="1"/>
+      <w:numFmt w:val="bullet"/>
+      <w:lvlText w:val=""/>
+      <w:lvlJc w:val="left"/>
+      <w:pPr>
+        <w:tabs>
+          <w:tab w:val="num" w:pos="6480"/>
+        </w:tabs>
+        <w:ind w:left="6480" w:hanging="360"/>
+      </w:pPr>
+      <w:rPr>
+        <w:rFonts w:ascii="Wingdings" w:hAnsi="Wingdings" w:hint="default"/>
+        <w:sz w:val="20"/>
+      </w:rPr>
+    </w:lvl>
+  </w:abstractNum>
+  <w:abstractNum w:abstractNumId="5" w15:restartNumberingAfterBreak="0">
     <w:nsid w:val="33672E2A"/>
     <w:multiLevelType w:val="multilevel"/>
     <w:tmpl w:val="712AFBFE"/>
@@ -1648,7 +3624,7 @@
       </w:rPr>
     </w:lvl>
   </w:abstractNum>
-  <w:abstractNum w:abstractNumId="3" w15:restartNumberingAfterBreak="0">
+  <w:abstractNum w:abstractNumId="6" w15:restartNumberingAfterBreak="0">
     <w:nsid w:val="3B2403FF"/>
     <w:multiLevelType w:val="multilevel"/>
     <w:tmpl w:val="1BEC6FCA"/>
@@ -1761,7 +3737,156 @@
       </w:rPr>
     </w:lvl>
   </w:abstractNum>
-  <w:abstractNum w:abstractNumId="4" w15:restartNumberingAfterBreak="0">
+  <w:abstractNum w:abstractNumId="7" w15:restartNumberingAfterBreak="0">
+    <w:nsid w:val="40B06FB8"/>
+    <w:multiLevelType w:val="multilevel"/>
+    <w:tmpl w:val="744E4036"/>
+    <w:lvl w:ilvl="0">
+      <w:start w:val="1"/>
+      <w:numFmt w:val="bullet"/>
+      <w:lvlText w:val=""/>
+      <w:lvlJc w:val="left"/>
+      <w:pPr>
+        <w:tabs>
+          <w:tab w:val="num" w:pos="720"/>
+        </w:tabs>
+        <w:ind w:left="720" w:hanging="360"/>
+      </w:pPr>
+      <w:rPr>
+        <w:rFonts w:ascii="Symbol" w:hAnsi="Symbol" w:hint="default"/>
+        <w:sz w:val="20"/>
+      </w:rPr>
+    </w:lvl>
+    <w:lvl w:ilvl="1">
+      <w:start w:val="1"/>
+      <w:numFmt w:val="bullet"/>
+      <w:lvlText w:val="o"/>
+      <w:lvlJc w:val="left"/>
+      <w:pPr>
+        <w:tabs>
+          <w:tab w:val="num" w:pos="1440"/>
+        </w:tabs>
+        <w:ind w:left="1440" w:hanging="360"/>
+      </w:pPr>
+      <w:rPr>
+        <w:rFonts w:ascii="Courier New" w:hAnsi="Courier New" w:hint="default"/>
+        <w:sz w:val="20"/>
+      </w:rPr>
+    </w:lvl>
+    <w:lvl w:ilvl="2" w:tentative="1">
+      <w:start w:val="1"/>
+      <w:numFmt w:val="bullet"/>
+      <w:lvlText w:val=""/>
+      <w:lvlJc w:val="left"/>
+      <w:pPr>
+        <w:tabs>
+          <w:tab w:val="num" w:pos="2160"/>
+        </w:tabs>
+        <w:ind w:left="2160" w:hanging="360"/>
+      </w:pPr>
+      <w:rPr>
+        <w:rFonts w:ascii="Wingdings" w:hAnsi="Wingdings" w:hint="default"/>
+        <w:sz w:val="20"/>
+      </w:rPr>
+    </w:lvl>
+    <w:lvl w:ilvl="3" w:tentative="1">
+      <w:start w:val="1"/>
+      <w:numFmt w:val="bullet"/>
+      <w:lvlText w:val=""/>
+      <w:lvlJc w:val="left"/>
+      <w:pPr>
+        <w:tabs>
+          <w:tab w:val="num" w:pos="2880"/>
+        </w:tabs>
+        <w:ind w:left="2880" w:hanging="360"/>
+      </w:pPr>
+      <w:rPr>
+        <w:rFonts w:ascii="Wingdings" w:hAnsi="Wingdings" w:hint="default"/>
+        <w:sz w:val="20"/>
+      </w:rPr>
+    </w:lvl>
+    <w:lvl w:ilvl="4" w:tentative="1">
+      <w:start w:val="1"/>
+      <w:numFmt w:val="bullet"/>
+      <w:lvlText w:val=""/>
+      <w:lvlJc w:val="left"/>
+      <w:pPr>
+        <w:tabs>
+          <w:tab w:val="num" w:pos="3600"/>
+        </w:tabs>
+        <w:ind w:left="3600" w:hanging="360"/>
+      </w:pPr>
+      <w:rPr>
+        <w:rFonts w:ascii="Wingdings" w:hAnsi="Wingdings" w:hint="default"/>
+        <w:sz w:val="20"/>
+      </w:rPr>
+    </w:lvl>
+    <w:lvl w:ilvl="5" w:tentative="1">
+      <w:start w:val="1"/>
+      <w:numFmt w:val="bullet"/>
+      <w:lvlText w:val=""/>
+      <w:lvlJc w:val="left"/>
+      <w:pPr>
+        <w:tabs>
+          <w:tab w:val="num" w:pos="4320"/>
+        </w:tabs>
+        <w:ind w:left="4320" w:hanging="360"/>
+      </w:pPr>
+      <w:rPr>
+        <w:rFonts w:ascii="Wingdings" w:hAnsi="Wingdings" w:hint="default"/>
+        <w:sz w:val="20"/>
+      </w:rPr>
+    </w:lvl>
+    <w:lvl w:ilvl="6" w:tentative="1">
+      <w:start w:val="1"/>
+      <w:numFmt w:val="bullet"/>
+      <w:lvlText w:val=""/>
+      <w:lvlJc w:val="left"/>
+      <w:pPr>
+        <w:tabs>
+          <w:tab w:val="num" w:pos="5040"/>
+        </w:tabs>
+        <w:ind w:left="5040" w:hanging="360"/>
+      </w:pPr>
+      <w:rPr>
+        <w:rFonts w:ascii="Wingdings" w:hAnsi="Wingdings" w:hint="default"/>
+        <w:sz w:val="20"/>
+      </w:rPr>
+    </w:lvl>
+    <w:lvl w:ilvl="7" w:tentative="1">
+      <w:start w:val="1"/>
+      <w:numFmt w:val="bullet"/>
+      <w:lvlText w:val=""/>
+      <w:lvlJc w:val="left"/>
+      <w:pPr>
+        <w:tabs>
+          <w:tab w:val="num" w:pos="5760"/>
+        </w:tabs>
+        <w:ind w:left="5760" w:hanging="360"/>
+      </w:pPr>
+      <w:rPr>
+        <w:rFonts w:ascii="Wingdings" w:hAnsi="Wingdings" w:hint="default"/>
+        <w:sz w:val="20"/>
+      </w:rPr>
+    </w:lvl>
+    <w:lvl w:ilvl="8" w:tentative="1">
+      <w:start w:val="1"/>
+      <w:numFmt w:val="bullet"/>
+      <w:lvlText w:val=""/>
+      <w:lvlJc w:val="left"/>
+      <w:pPr>
+        <w:tabs>
+          <w:tab w:val="num" w:pos="6480"/>
+        </w:tabs>
+        <w:ind w:left="6480" w:hanging="360"/>
+      </w:pPr>
+      <w:rPr>
+        <w:rFonts w:ascii="Wingdings" w:hAnsi="Wingdings" w:hint="default"/>
+        <w:sz w:val="20"/>
+      </w:rPr>
+    </w:lvl>
+  </w:abstractNum>
+  <w:abstractNum w:abstractNumId="8" w15:restartNumberingAfterBreak="0">
     <w:nsid w:val="45C26828"/>
     <w:multiLevelType w:val="multilevel"/>
     <w:tmpl w:val="35A42F8C"/>
@@ -1910,7 +4035,305 @@
       </w:rPr>
     </w:lvl>
   </w:abstractNum>
-  <w:abstractNum w:abstractNumId="5" w15:restartNumberingAfterBreak="0">
+  <w:abstractNum w:abstractNumId="9" w15:restartNumberingAfterBreak="0">
+    <w:nsid w:val="496854EA"/>
+    <w:multiLevelType w:val="multilevel"/>
+    <w:tmpl w:val="D24C2AA4"/>
+    <w:lvl w:ilvl="0">
+      <w:start w:val="1"/>
+      <w:numFmt w:val="bullet"/>
+      <w:lvlText w:val=""/>
+      <w:lvlJc w:val="left"/>
+      <w:pPr>
+        <w:tabs>
+          <w:tab w:val="num" w:pos="720"/>
+        </w:tabs>
+        <w:ind w:left="720" w:hanging="360"/>
+      </w:pPr>
+      <w:rPr>
+        <w:rFonts w:ascii="Symbol" w:hAnsi="Symbol" w:hint="default"/>
+        <w:sz w:val="20"/>
+      </w:rPr>
+    </w:lvl>
+    <w:lvl w:ilvl="1">
+      <w:start w:val="1"/>
+      <w:numFmt w:val="bullet"/>
+      <w:lvlText w:val="o"/>
+      <w:lvlJc w:val="left"/>
+      <w:pPr>
+        <w:tabs>
+          <w:tab w:val="num" w:pos="1440"/>
+        </w:tabs>
+        <w:ind w:left="1440" w:hanging="360"/>
+      </w:pPr>
+      <w:rPr>
+        <w:rFonts w:ascii="Courier New" w:hAnsi="Courier New" w:hint="default"/>
+        <w:sz w:val="20"/>
+      </w:rPr>
+    </w:lvl>
+    <w:lvl w:ilvl="2" w:tentative="1">
+      <w:start w:val="1"/>
+      <w:numFmt w:val="bullet"/>
+      <w:lvlText w:val=""/>
+      <w:lvlJc w:val="left"/>
+      <w:pPr>
+        <w:tabs>
+          <w:tab w:val="num" w:pos="2160"/>
+        </w:tabs>
+        <w:ind w:left="2160" w:hanging="360"/>
+      </w:pPr>
+      <w:rPr>
+        <w:rFonts w:ascii="Wingdings" w:hAnsi="Wingdings" w:hint="default"/>
+        <w:sz w:val="20"/>
+      </w:rPr>
+    </w:lvl>
+    <w:lvl w:ilvl="3" w:tentative="1">
+      <w:start w:val="1"/>
+      <w:numFmt w:val="bullet"/>
+      <w:lvlText w:val=""/>
+      <w:lvlJc w:val="left"/>
+      <w:pPr>
+        <w:tabs>
+          <w:tab w:val="num" w:pos="2880"/>
+        </w:tabs>
+        <w:ind w:left="2880" w:hanging="360"/>
+      </w:pPr>
+      <w:rPr>
+        <w:rFonts w:ascii="Wingdings" w:hAnsi="Wingdings" w:hint="default"/>
+        <w:sz w:val="20"/>
+      </w:rPr>
+    </w:lvl>
+    <w:lvl w:ilvl="4" w:tentative="1">
+      <w:start w:val="1"/>
+      <w:numFmt w:val="bullet"/>
+      <w:lvlText w:val=""/>
+      <w:lvlJc w:val="left"/>
+      <w:pPr>
+        <w:tabs>
+          <w:tab w:val="num" w:pos="3600"/>
+        </w:tabs>
+        <w:ind w:left="3600" w:hanging="360"/>
+      </w:pPr>
+      <w:rPr>
+        <w:rFonts w:ascii="Wingdings" w:hAnsi="Wingdings" w:hint="default"/>
+        <w:sz w:val="20"/>
+      </w:rPr>
+    </w:lvl>
+    <w:lvl w:ilvl="5" w:tentative="1">
+      <w:start w:val="1"/>
+      <w:numFmt w:val="bullet"/>
+      <w:lvlText w:val=""/>
+      <w:lvlJc w:val="left"/>
+      <w:pPr>
+        <w:tabs>
+          <w:tab w:val="num" w:pos="4320"/>
+        </w:tabs>
+        <w:ind w:left="4320" w:hanging="360"/>
+      </w:pPr>
+      <w:rPr>
+        <w:rFonts w:ascii="Wingdings" w:hAnsi="Wingdings" w:hint="default"/>
+        <w:sz w:val="20"/>
+      </w:rPr>
+    </w:lvl>
+    <w:lvl w:ilvl="6" w:tentative="1">
+      <w:start w:val="1"/>
+      <w:numFmt w:val="bullet"/>
+      <w:lvlText w:val=""/>
+      <w:lvlJc w:val="left"/>
+      <w:pPr>
+        <w:tabs>
+          <w:tab w:val="num" w:pos="5040"/>
+        </w:tabs>
+        <w:ind w:left="5040" w:hanging="360"/>
+      </w:pPr>
+      <w:rPr>
+        <w:rFonts w:ascii="Wingdings" w:hAnsi="Wingdings" w:hint="default"/>
+        <w:sz w:val="20"/>
+      </w:rPr>
+    </w:lvl>
+    <w:lvl w:ilvl="7" w:tentative="1">
+      <w:start w:val="1"/>
+      <w:numFmt w:val="bullet"/>
+      <w:lvlText w:val=""/>
+      <w:lvlJc w:val="left"/>
+      <w:pPr>
+        <w:tabs>
+          <w:tab w:val="num" w:pos="5760"/>
+        </w:tabs>
+        <w:ind w:left="5760" w:hanging="360"/>
+      </w:pPr>
+      <w:rPr>
+        <w:rFonts w:ascii="Wingdings" w:hAnsi="Wingdings" w:hint="default"/>
+        <w:sz w:val="20"/>
+      </w:rPr>
+    </w:lvl>
+    <w:lvl w:ilvl="8" w:tentative="1">
+      <w:start w:val="1"/>
+      <w:numFmt w:val="bullet"/>
+      <w:lvlText w:val=""/>
+      <w:lvlJc w:val="left"/>
+      <w:pPr>
+        <w:tabs>
+          <w:tab w:val="num" w:pos="6480"/>
+        </w:tabs>
+        <w:ind w:left="6480" w:hanging="360"/>
+      </w:pPr>
+      <w:rPr>
+        <w:rFonts w:ascii="Wingdings" w:hAnsi="Wingdings" w:hint="default"/>
+        <w:sz w:val="20"/>
+      </w:rPr>
+    </w:lvl>
+  </w:abstractNum>
+  <w:abstractNum w:abstractNumId="10" w15:restartNumberingAfterBreak="0">
+    <w:nsid w:val="5258431C"/>
+    <w:multiLevelType w:val="multilevel"/>
+    <w:tmpl w:val="AD9008A2"/>
+    <w:lvl w:ilvl="0">
+      <w:start w:val="1"/>
+      <w:numFmt w:val="bullet"/>
+      <w:lvlText w:val=""/>
+      <w:lvlJc w:val="left"/>
+      <w:pPr>
+        <w:tabs>
+          <w:tab w:val="num" w:pos="720"/>
+        </w:tabs>
+        <w:ind w:left="720" w:hanging="360"/>
+      </w:pPr>
+      <w:rPr>
+        <w:rFonts w:ascii="Symbol" w:hAnsi="Symbol" w:hint="default"/>
+        <w:sz w:val="20"/>
+      </w:rPr>
+    </w:lvl>
+    <w:lvl w:ilvl="1">
+      <w:start w:val="1"/>
+      <w:numFmt w:val="bullet"/>
+      <w:lvlText w:val="o"/>
+      <w:lvlJc w:val="left"/>
+      <w:pPr>
+        <w:tabs>
+          <w:tab w:val="num" w:pos="1440"/>
+        </w:tabs>
+        <w:ind w:left="1440" w:hanging="360"/>
+      </w:pPr>
+      <w:rPr>
+        <w:rFonts w:ascii="Courier New" w:hAnsi="Courier New" w:hint="default"/>
+        <w:sz w:val="20"/>
+      </w:rPr>
+    </w:lvl>
+    <w:lvl w:ilvl="2" w:tentative="1">
+      <w:start w:val="1"/>
+      <w:numFmt w:val="bullet"/>
+      <w:lvlText w:val=""/>
+      <w:lvlJc w:val="left"/>
+      <w:pPr>
+        <w:tabs>
+          <w:tab w:val="num" w:pos="2160"/>
+        </w:tabs>
+        <w:ind w:left="2160" w:hanging="360"/>
+      </w:pPr>
+      <w:rPr>
+        <w:rFonts w:ascii="Wingdings" w:hAnsi="Wingdings" w:hint="default"/>
+        <w:sz w:val="20"/>
+      </w:rPr>
+    </w:lvl>
+    <w:lvl w:ilvl="3" w:tentative="1">
+      <w:start w:val="1"/>
+      <w:numFmt w:val="bullet"/>
+      <w:lvlText w:val=""/>
+      <w:lvlJc w:val="left"/>
+      <w:pPr>
+        <w:tabs>
+          <w:tab w:val="num" w:pos="2880"/>
+        </w:tabs>
+        <w:ind w:left="2880" w:hanging="360"/>
+      </w:pPr>
+      <w:rPr>
+        <w:rFonts w:ascii="Wingdings" w:hAnsi="Wingdings" w:hint="default"/>
+        <w:sz w:val="20"/>
+      </w:rPr>
+    </w:lvl>
+    <w:lvl w:ilvl="4" w:tentative="1">
+      <w:start w:val="1"/>
+      <w:numFmt w:val="bullet"/>
+      <w:lvlText w:val=""/>
+      <w:lvlJc w:val="left"/>
+      <w:pPr>
+        <w:tabs>
+          <w:tab w:val="num" w:pos="3600"/>
+        </w:tabs>
+        <w:ind w:left="3600" w:hanging="360"/>
+      </w:pPr>
+      <w:rPr>
+        <w:rFonts w:ascii="Wingdings" w:hAnsi="Wingdings" w:hint="default"/>
+        <w:sz w:val="20"/>
+      </w:rPr>
+    </w:lvl>
+    <w:lvl w:ilvl="5" w:tentative="1">
+      <w:start w:val="1"/>
+      <w:numFmt w:val="bullet"/>
+      <w:lvlText w:val=""/>
+      <w:lvlJc w:val="left"/>
+      <w:pPr>
+        <w:tabs>
+          <w:tab w:val="num" w:pos="4320"/>
+        </w:tabs>
+        <w:ind w:left="4320" w:hanging="360"/>
+      </w:pPr>
+      <w:rPr>
+        <w:rFonts w:ascii="Wingdings" w:hAnsi="Wingdings" w:hint="default"/>
+        <w:sz w:val="20"/>
+      </w:rPr>
+    </w:lvl>
+    <w:lvl w:ilvl="6" w:tentative="1">
+      <w:start w:val="1"/>
+      <w:numFmt w:val="bullet"/>
+      <w:lvlText w:val=""/>
+      <w:lvlJc w:val="left"/>
+      <w:pPr>
+        <w:tabs>
+          <w:tab w:val="num" w:pos="5040"/>
+        </w:tabs>
+        <w:ind w:left="5040" w:hanging="360"/>
+      </w:pPr>
+      <w:rPr>
+        <w:rFonts w:ascii="Wingdings" w:hAnsi="Wingdings" w:hint="default"/>
+        <w:sz w:val="20"/>
+      </w:rPr>
+    </w:lvl>
+    <w:lvl w:ilvl="7" w:tentative="1">
+      <w:start w:val="1"/>
+      <w:numFmt w:val="bullet"/>
+      <w:lvlText w:val=""/>
+      <w:lvlJc w:val="left"/>
+      <w:pPr>
+        <w:tabs>
+          <w:tab w:val="num" w:pos="5760"/>
+        </w:tabs>
+        <w:ind w:left="5760" w:hanging="360"/>
+      </w:pPr>
+      <w:rPr>
+        <w:rFonts w:ascii="Wingdings" w:hAnsi="Wingdings" w:hint="default"/>
+        <w:sz w:val="20"/>
+      </w:rPr>
+    </w:lvl>
+    <w:lvl w:ilvl="8" w:tentative="1">
+      <w:start w:val="1"/>
+      <w:numFmt w:val="bullet"/>
+      <w:lvlText w:val=""/>
+      <w:lvlJc w:val="left"/>
+      <w:pPr>
+        <w:tabs>
+          <w:tab w:val="num" w:pos="6480"/>
+        </w:tabs>
+        <w:ind w:left="6480" w:hanging="360"/>
+      </w:pPr>
+      <w:rPr>
+        <w:rFonts w:ascii="Wingdings" w:hAnsi="Wingdings" w:hint="default"/>
+        <w:sz w:val="20"/>
+      </w:rPr>
+    </w:lvl>
+  </w:abstractNum>
+  <w:abstractNum w:abstractNumId="11" w15:restartNumberingAfterBreak="0">
     <w:nsid w:val="575A5F94"/>
     <w:multiLevelType w:val="multilevel"/>
     <w:tmpl w:val="00AC09E2"/>
@@ -2023,7 +4446,305 @@
       </w:rPr>
     </w:lvl>
   </w:abstractNum>
-  <w:abstractNum w:abstractNumId="6" w15:restartNumberingAfterBreak="0">
+  <w:abstractNum w:abstractNumId="12" w15:restartNumberingAfterBreak="0">
+    <w:nsid w:val="66B926B3"/>
+    <w:multiLevelType w:val="multilevel"/>
+    <w:tmpl w:val="B8947EF8"/>
+    <w:lvl w:ilvl="0">
+      <w:start w:val="1"/>
+      <w:numFmt w:val="bullet"/>
+      <w:lvlText w:val=""/>
+      <w:lvlJc w:val="left"/>
+      <w:pPr>
+        <w:tabs>
+          <w:tab w:val="num" w:pos="720"/>
+        </w:tabs>
+        <w:ind w:left="720" w:hanging="360"/>
+      </w:pPr>
+      <w:rPr>
+        <w:rFonts w:ascii="Symbol" w:hAnsi="Symbol" w:hint="default"/>
+        <w:sz w:val="20"/>
+      </w:rPr>
+    </w:lvl>
+    <w:lvl w:ilvl="1">
+      <w:start w:val="1"/>
+      <w:numFmt w:val="bullet"/>
+      <w:lvlText w:val="o"/>
+      <w:lvlJc w:val="left"/>
+      <w:pPr>
+        <w:tabs>
+          <w:tab w:val="num" w:pos="1440"/>
+        </w:tabs>
+        <w:ind w:left="1440" w:hanging="360"/>
+      </w:pPr>
+      <w:rPr>
+        <w:rFonts w:ascii="Courier New" w:hAnsi="Courier New" w:hint="default"/>
+        <w:sz w:val="20"/>
+      </w:rPr>
+    </w:lvl>
+    <w:lvl w:ilvl="2" w:tentative="1">
+      <w:start w:val="1"/>
+      <w:numFmt w:val="bullet"/>
+      <w:lvlText w:val=""/>
+      <w:lvlJc w:val="left"/>
+      <w:pPr>
+        <w:tabs>
+          <w:tab w:val="num" w:pos="2160"/>
+        </w:tabs>
+        <w:ind w:left="2160" w:hanging="360"/>
+      </w:pPr>
+      <w:rPr>
+        <w:rFonts w:ascii="Wingdings" w:hAnsi="Wingdings" w:hint="default"/>
+        <w:sz w:val="20"/>
+      </w:rPr>
+    </w:lvl>
+    <w:lvl w:ilvl="3" w:tentative="1">
+      <w:start w:val="1"/>
+      <w:numFmt w:val="bullet"/>
+      <w:lvlText w:val=""/>
+      <w:lvlJc w:val="left"/>
+      <w:pPr>
+        <w:tabs>
+          <w:tab w:val="num" w:pos="2880"/>
+        </w:tabs>
+        <w:ind w:left="2880" w:hanging="360"/>
+      </w:pPr>
+      <w:rPr>
+        <w:rFonts w:ascii="Wingdings" w:hAnsi="Wingdings" w:hint="default"/>
+        <w:sz w:val="20"/>
+      </w:rPr>
+    </w:lvl>
+    <w:lvl w:ilvl="4" w:tentative="1">
+      <w:start w:val="1"/>
+      <w:numFmt w:val="bullet"/>
+      <w:lvlText w:val=""/>
+      <w:lvlJc w:val="left"/>
+      <w:pPr>
+        <w:tabs>
+          <w:tab w:val="num" w:pos="3600"/>
+        </w:tabs>
+        <w:ind w:left="3600" w:hanging="360"/>
+      </w:pPr>
+      <w:rPr>
+        <w:rFonts w:ascii="Wingdings" w:hAnsi="Wingdings" w:hint="default"/>
+        <w:sz w:val="20"/>
+      </w:rPr>
+    </w:lvl>
+    <w:lvl w:ilvl="5" w:tentative="1">
+      <w:start w:val="1"/>
+      <w:numFmt w:val="bullet"/>
+      <w:lvlText w:val=""/>
+      <w:lvlJc w:val="left"/>
+      <w:pPr>
+        <w:tabs>
+          <w:tab w:val="num" w:pos="4320"/>
+        </w:tabs>
+        <w:ind w:left="4320" w:hanging="360"/>
+      </w:pPr>
+      <w:rPr>
+        <w:rFonts w:ascii="Wingdings" w:hAnsi="Wingdings" w:hint="default"/>
+        <w:sz w:val="20"/>
+      </w:rPr>
+    </w:lvl>
+    <w:lvl w:ilvl="6" w:tentative="1">
+      <w:start w:val="1"/>
+      <w:numFmt w:val="bullet"/>
+      <w:lvlText w:val=""/>
+      <w:lvlJc w:val="left"/>
+      <w:pPr>
+        <w:tabs>
+          <w:tab w:val="num" w:pos="5040"/>
+        </w:tabs>
+        <w:ind w:left="5040" w:hanging="360"/>
+      </w:pPr>
+      <w:rPr>
+        <w:rFonts w:ascii="Wingdings" w:hAnsi="Wingdings" w:hint="default"/>
+        <w:sz w:val="20"/>
+      </w:rPr>
+    </w:lvl>
+    <w:lvl w:ilvl="7" w:tentative="1">
+      <w:start w:val="1"/>
+      <w:numFmt w:val="bullet"/>
+      <w:lvlText w:val=""/>
+      <w:lvlJc w:val="left"/>
+      <w:pPr>
+        <w:tabs>
+          <w:tab w:val="num" w:pos="5760"/>
+        </w:tabs>
+        <w:ind w:left="5760" w:hanging="360"/>
+      </w:pPr>
+      <w:rPr>
+        <w:rFonts w:ascii="Wingdings" w:hAnsi="Wingdings" w:hint="default"/>
+        <w:sz w:val="20"/>
+      </w:rPr>
+    </w:lvl>
+    <w:lvl w:ilvl="8" w:tentative="1">
+      <w:start w:val="1"/>
+      <w:numFmt w:val="bullet"/>
+      <w:lvlText w:val=""/>
+      <w:lvlJc w:val="left"/>
+      <w:pPr>
+        <w:tabs>
+          <w:tab w:val="num" w:pos="6480"/>
+        </w:tabs>
+        <w:ind w:left="6480" w:hanging="360"/>
+      </w:pPr>
+      <w:rPr>
+        <w:rFonts w:ascii="Wingdings" w:hAnsi="Wingdings" w:hint="default"/>
+        <w:sz w:val="20"/>
+      </w:rPr>
+    </w:lvl>
+  </w:abstractNum>
+  <w:abstractNum w:abstractNumId="13" w15:restartNumberingAfterBreak="0">
+    <w:nsid w:val="6D1E558B"/>
+    <w:multiLevelType w:val="multilevel"/>
+    <w:tmpl w:val="FAE483BA"/>
+    <w:lvl w:ilvl="0">
+      <w:start w:val="1"/>
+      <w:numFmt w:val="bullet"/>
+      <w:lvlText w:val=""/>
+      <w:lvlJc w:val="left"/>
+      <w:pPr>
+        <w:tabs>
+          <w:tab w:val="num" w:pos="720"/>
+        </w:tabs>
+        <w:ind w:left="720" w:hanging="360"/>
+      </w:pPr>
+      <w:rPr>
+        <w:rFonts w:ascii="Symbol" w:hAnsi="Symbol" w:hint="default"/>
+        <w:sz w:val="20"/>
+      </w:rPr>
+    </w:lvl>
+    <w:lvl w:ilvl="1" w:tentative="1">
+      <w:start w:val="1"/>
+      <w:numFmt w:val="bullet"/>
+      <w:lvlText w:val="o"/>
+      <w:lvlJc w:val="left"/>
+      <w:pPr>
+        <w:tabs>
+          <w:tab w:val="num" w:pos="1440"/>
+        </w:tabs>
+        <w:ind w:left="1440" w:hanging="360"/>
+      </w:pPr>
+      <w:rPr>
+        <w:rFonts w:ascii="Courier New" w:hAnsi="Courier New" w:hint="default"/>
+        <w:sz w:val="20"/>
+      </w:rPr>
+    </w:lvl>
+    <w:lvl w:ilvl="2" w:tentative="1">
+      <w:start w:val="1"/>
+      <w:numFmt w:val="bullet"/>
+      <w:lvlText w:val=""/>
+      <w:lvlJc w:val="left"/>
+      <w:pPr>
+        <w:tabs>
+          <w:tab w:val="num" w:pos="2160"/>
+        </w:tabs>
+        <w:ind w:left="2160" w:hanging="360"/>
+      </w:pPr>
+      <w:rPr>
+        <w:rFonts w:ascii="Wingdings" w:hAnsi="Wingdings" w:hint="default"/>
+        <w:sz w:val="20"/>
+      </w:rPr>
+    </w:lvl>
+    <w:lvl w:ilvl="3" w:tentative="1">
+      <w:start w:val="1"/>
+      <w:numFmt w:val="bullet"/>
+      <w:lvlText w:val=""/>
+      <w:lvlJc w:val="left"/>
+      <w:pPr>
+        <w:tabs>
+          <w:tab w:val="num" w:pos="2880"/>
+        </w:tabs>
+        <w:ind w:left="2880" w:hanging="360"/>
+      </w:pPr>
+      <w:rPr>
+        <w:rFonts w:ascii="Wingdings" w:hAnsi="Wingdings" w:hint="default"/>
+        <w:sz w:val="20"/>
+      </w:rPr>
+    </w:lvl>
+    <w:lvl w:ilvl="4" w:tentative="1">
+      <w:start w:val="1"/>
+      <w:numFmt w:val="bullet"/>
+      <w:lvlText w:val=""/>
+      <w:lvlJc w:val="left"/>
+      <w:pPr>
+        <w:tabs>
+          <w:tab w:val="num" w:pos="3600"/>
+        </w:tabs>
+        <w:ind w:left="3600" w:hanging="360"/>
+      </w:pPr>
+      <w:rPr>
+        <w:rFonts w:ascii="Wingdings" w:hAnsi="Wingdings" w:hint="default"/>
+        <w:sz w:val="20"/>
+      </w:rPr>
+    </w:lvl>
+    <w:lvl w:ilvl="5" w:tentative="1">
+      <w:start w:val="1"/>
+      <w:numFmt w:val="bullet"/>
+      <w:lvlText w:val=""/>
+      <w:lvlJc w:val="left"/>
+      <w:pPr>
+        <w:tabs>
+          <w:tab w:val="num" w:pos="4320"/>
+        </w:tabs>
+        <w:ind w:left="4320" w:hanging="360"/>
+      </w:pPr>
+      <w:rPr>
+        <w:rFonts w:ascii="Wingdings" w:hAnsi="Wingdings" w:hint="default"/>
+        <w:sz w:val="20"/>
+      </w:rPr>
+    </w:lvl>
+    <w:lvl w:ilvl="6" w:tentative="1">
+      <w:start w:val="1"/>
+      <w:numFmt w:val="bullet"/>
+      <w:lvlText w:val=""/>
+      <w:lvlJc w:val="left"/>
+      <w:pPr>
+        <w:tabs>
+          <w:tab w:val="num" w:pos="5040"/>
+        </w:tabs>
+        <w:ind w:left="5040" w:hanging="360"/>
+      </w:pPr>
+      <w:rPr>
+        <w:rFonts w:ascii="Wingdings" w:hAnsi="Wingdings" w:hint="default"/>
+        <w:sz w:val="20"/>
+      </w:rPr>
+    </w:lvl>
+    <w:lvl w:ilvl="7" w:tentative="1">
+      <w:start w:val="1"/>
+      <w:numFmt w:val="bullet"/>
+      <w:lvlText w:val=""/>
+      <w:lvlJc w:val="left"/>
+      <w:pPr>
+        <w:tabs>
+          <w:tab w:val="num" w:pos="5760"/>
+        </w:tabs>
+        <w:ind w:left="5760" w:hanging="360"/>
+      </w:pPr>
+      <w:rPr>
+        <w:rFonts w:ascii="Wingdings" w:hAnsi="Wingdings" w:hint="default"/>
+        <w:sz w:val="20"/>
+      </w:rPr>
+    </w:lvl>
+    <w:lvl w:ilvl="8" w:tentative="1">
+      <w:start w:val="1"/>
+      <w:numFmt w:val="bullet"/>
+      <w:lvlText w:val=""/>
+      <w:lvlJc w:val="left"/>
+      <w:pPr>
+        <w:tabs>
+          <w:tab w:val="num" w:pos="6480"/>
+        </w:tabs>
+        <w:ind w:left="6480" w:hanging="360"/>
+      </w:pPr>
+      <w:rPr>
+        <w:rFonts w:ascii="Wingdings" w:hAnsi="Wingdings" w:hint="default"/>
+        <w:sz w:val="20"/>
+      </w:rPr>
+    </w:lvl>
+  </w:abstractNum>
+  <w:abstractNum w:abstractNumId="14" w15:restartNumberingAfterBreak="0">
     <w:nsid w:val="6F6B3BF7"/>
     <w:multiLevelType w:val="multilevel"/>
     <w:tmpl w:val="6CD20C66"/>
@@ -2172,7 +4893,7 @@
       </w:rPr>
     </w:lvl>
   </w:abstractNum>
-  <w:abstractNum w:abstractNumId="7" w15:restartNumberingAfterBreak="0">
+  <w:abstractNum w:abstractNumId="15" w15:restartNumberingAfterBreak="0">
     <w:nsid w:val="71E778E8"/>
     <w:multiLevelType w:val="multilevel"/>
     <w:tmpl w:val="448ABAF0"/>
@@ -2321,7 +5042,7 @@
       </w:rPr>
     </w:lvl>
   </w:abstractNum>
-  <w:abstractNum w:abstractNumId="8" w15:restartNumberingAfterBreak="0">
+  <w:abstractNum w:abstractNumId="16" w15:restartNumberingAfterBreak="0">
     <w:nsid w:val="73973AFE"/>
     <w:multiLevelType w:val="multilevel"/>
     <w:tmpl w:val="E5323B9C"/>
@@ -2471,31 +5192,55 @@
     </w:lvl>
   </w:abstractNum>
   <w:num w:numId="1" w16cid:durableId="842360072">
-    <w:abstractNumId w:val="5"/>
+    <w:abstractNumId w:val="11"/>
   </w:num>
   <w:num w:numId="2" w16cid:durableId="1038898480">
-    <w:abstractNumId w:val="3"/>
+    <w:abstractNumId w:val="6"/>
   </w:num>
   <w:num w:numId="3" w16cid:durableId="560941626">
-    <w:abstractNumId w:val="8"/>
+    <w:abstractNumId w:val="16"/>
   </w:num>
   <w:num w:numId="4" w16cid:durableId="746465899">
-    <w:abstractNumId w:val="4"/>
+    <w:abstractNumId w:val="8"/>
   </w:num>
   <w:num w:numId="5" w16cid:durableId="330526054">
     <w:abstractNumId w:val="0"/>
   </w:num>
   <w:num w:numId="6" w16cid:durableId="1800224471">
+    <w:abstractNumId w:val="5"/>
+  </w:num>
+  <w:num w:numId="7" w16cid:durableId="2012482960">
+    <w:abstractNumId w:val="14"/>
+  </w:num>
+  <w:num w:numId="8" w16cid:durableId="1279292242">
     <w:abstractNumId w:val="2"/>
   </w:num>
-  <w:num w:numId="7" w16cid:durableId="2012482960">
-    <w:abstractNumId w:val="6"/>
+  <w:num w:numId="9" w16cid:durableId="63340339">
+    <w:abstractNumId w:val="15"/>
   </w:num>
-  <w:num w:numId="8" w16cid:durableId="1279292242">
+  <w:num w:numId="10" w16cid:durableId="1106535023">
+    <w:abstractNumId w:val="10"/>
+  </w:num>
+  <w:num w:numId="11" w16cid:durableId="804854078">
+    <w:abstractNumId w:val="3"/>
+  </w:num>
+  <w:num w:numId="12" w16cid:durableId="1680506405">
+    <w:abstractNumId w:val="7"/>
+  </w:num>
+  <w:num w:numId="13" w16cid:durableId="1901288880">
+    <w:abstractNumId w:val="4"/>
+  </w:num>
+  <w:num w:numId="14" w16cid:durableId="1814441861">
     <w:abstractNumId w:val="1"/>
   </w:num>
-  <w:num w:numId="9" w16cid:durableId="63340339">
-    <w:abstractNumId w:val="7"/>
+  <w:num w:numId="15" w16cid:durableId="320432781">
+    <w:abstractNumId w:val="9"/>
+  </w:num>
+  <w:num w:numId="16" w16cid:durableId="76488731">
+    <w:abstractNumId w:val="13"/>
+  </w:num>
+  <w:num w:numId="17" w16cid:durableId="671759967">
+    <w:abstractNumId w:val="12"/>
   </w:num>
 </w:numbering>
 </file>

</xml_diff>